<commit_message>
refactor(讲义): 元素化学 retrofit 四讲
</commit_message>
<xml_diff>
--- a/06-学生侧材料/讲义/5-无机化学/元素推断综合训练-超级充实版（自学完整）.docx
+++ b/06-学生侧材料/讲义/5-无机化学/元素推断综合训练-超级充实版（自学完整）.docx
@@ -2163,6 +2163,7 @@
     <w:p>
       <w:pPr>
         <w:pStyle w:val="BodyText"/>
+        <w:spacing w:after="80"/>
         <w:ind w:firstLine="420"/>
       </w:pPr>
       <w:r>
@@ -2374,172 +2375,254 @@
         <w:t>。</w:t>
       </w:r>
     </w:p>
-    <w:p>
-      <w:pPr>
-        <w:pStyle w:val="BodyText"/>
-        <w:spacing w:before="160" w:after="80"/>
+    <w:tbl>
+      <w:tblPr>
+        <w:tblStyle w:val="Table"/>
+        <w:tblW w:type="pct" w:w="5000"/>
+        <w:tblLayout w:type="fixed"/>
+        <w:tblLook w:firstRow="1" w:lastRow="0" w:firstColumn="0" w:lastColumn="0" w:noHBand="0" w:noVBand="0" w:val="0020"/>
         <w:jc w:val="center"/>
-      </w:pPr>
-      <w:r>
-        <w:rPr>
-          <w:rFonts w:ascii="Times New Roman" w:hAnsi="Times New Roman" w:eastAsia="Times New Roman" w:cs="Times New Roman"/>
-        </w:rPr>
-        <w:drawing>
-          <wp:inline>
-            <wp:extent cx="2667000" cy="1171094"/>
-            <wp:effectExtent b="0" l="0" r="0" t="0"/>
-            <wp:docPr descr="" title="" id="11" name="Picture"/>
-            <a:graphic>
-              <a:graphicData uri="http://schemas.openxmlformats.org/drawingml/2006/picture">
-                <pic:pic>
-                  <pic:nvPicPr>
-                    <pic:cNvPr descr="6f2f8853aa24c146e33ba4e84e2cbca183fbab4964453210fb26bf152a97604d.png" id="12" name="Picture"/>
-                    <pic:cNvPicPr>
-                      <a:picLocks noChangeArrowheads="1" noChangeAspect="1"/>
-                    </pic:cNvPicPr>
-                  </pic:nvPicPr>
-                  <pic:blipFill>
-                    <a:blip r:embed="rId10"/>
-                    <a:stretch>
-                      <a:fillRect/>
-                    </a:stretch>
-                  </pic:blipFill>
-                  <pic:spPr bwMode="auto">
-                    <a:xfrm>
-                      <a:off x="0" y="0"/>
-                      <a:ext cx="2667000" cy="1171094"/>
-                    </a:xfrm>
-                    <a:prstGeom prst="rect">
-                      <a:avLst/>
-                    </a:prstGeom>
-                    <a:noFill/>
-                    <a:ln w="9525">
-                      <a:noFill/>
-                      <a:headEnd/>
-                      <a:tailEnd/>
-                    </a:ln>
-                  </pic:spPr>
-                </pic:pic>
-              </a:graphicData>
-            </a:graphic>
-          </wp:inline>
-        </w:drawing>
-      </w:r>
-      <w:r>
-        <w:rPr>
-          <w:rFonts w:ascii="Times New Roman" w:hAnsi="Times New Roman" w:eastAsia="Times New Roman" w:cs="Times New Roman"/>
-        </w:rPr>
-        <w:t xml:space="preserve"> </w:t>
-      </w:r>
-      <w:r>
-        <w:rPr>
-          <w:rFonts w:ascii="Times New Roman" w:hAnsi="Times New Roman" w:eastAsia="Times New Roman" w:cs="Times New Roman"/>
-        </w:rPr>
-        <w:t xml:space="preserve">&gt; </w:t>
-      </w:r>
-      <w:r>
-        <w:rPr>
-          <w:rFonts w:hint="eastAsia" w:ascii="Times New Roman" w:hAnsi="Times New Roman" w:eastAsia="FangSong" w:cs="Times New Roman"/>
-        </w:rPr>
-        <w:t xml:space="preserve">图</w:t>
-      </w:r>
-      <w:r>
-        <w:rPr>
-          <w:rFonts w:ascii="Times New Roman" w:hAnsi="Times New Roman" w:eastAsia="Times New Roman" w:cs="Times New Roman"/>
-        </w:rPr>
-        <w:t xml:space="preserve"> </w:t>
-      </w:r>
-      <w:r>
-        <w:rPr>
-          <w:rFonts w:hint="eastAsia" w:ascii="Times New Roman" w:hAnsi="Times New Roman" w:eastAsia="Times New Roman" w:cs="Times New Roman"/>
-        </w:rPr>
-        <w:t>8-1：</w:t>
-      </w:r>
-      <w:r>
-        <w:rPr>
-          <w:rFonts w:hint="eastAsia" w:ascii="Times New Roman" w:hAnsi="Times New Roman" w:eastAsia="FangSong" w:cs="Times New Roman"/>
-        </w:rPr>
-        <w:t>元素推断</w:t>
-      </w:r>
-      <w:r>
-        <w:rPr>
-          <w:rFonts w:hint="eastAsia" w:ascii="Times New Roman" w:hAnsi="Times New Roman" w:eastAsia="Times New Roman" w:cs="Times New Roman"/>
-        </w:rPr>
-        <w:t>「</w:t>
-      </w:r>
-      <w:r>
-        <w:rPr>
-          <w:rFonts w:hint="eastAsia" w:ascii="Times New Roman" w:hAnsi="Times New Roman" w:eastAsia="FangSong" w:cs="Times New Roman"/>
-        </w:rPr>
-        <w:t>四步法</w:t>
-      </w:r>
-      <w:r>
-        <w:rPr>
-          <w:rFonts w:hint="eastAsia" w:ascii="Times New Roman" w:hAnsi="Times New Roman" w:eastAsia="Times New Roman" w:cs="Times New Roman"/>
-        </w:rPr>
-        <w:t>」</w:t>
-      </w:r>
-      <w:r>
-        <w:rPr>
-          <w:rFonts w:hint="eastAsia" w:ascii="Times New Roman" w:hAnsi="Times New Roman" w:eastAsia="FangSong" w:cs="Times New Roman"/>
-        </w:rPr>
-        <w:t>决策闭环体系</w:t>
-      </w:r>
-      <w:r>
-        <w:rPr>
-          <w:rFonts w:hint="eastAsia" w:ascii="Times New Roman" w:hAnsi="Times New Roman" w:eastAsia="Times New Roman" w:cs="Times New Roman"/>
-        </w:rPr>
-        <w:t>（</w:t>
-      </w:r>
-      <w:r>
-        <w:rPr>
-          <w:rFonts w:hint="eastAsia" w:ascii="Times New Roman" w:hAnsi="Times New Roman" w:eastAsia="FangSong" w:cs="Times New Roman"/>
-        </w:rPr>
-        <w:t>抓取信号</w:t>
-      </w:r>
-      <w:r>
-        <w:rPr>
-          <w:rFonts w:ascii="Times New Roman" w:hAnsi="Times New Roman" w:eastAsia="Times New Roman" w:cs="Times New Roman"/>
-        </w:rPr>
-        <w:t xml:space="preserve"> → </w:t>
-      </w:r>
-      <w:r>
-        <w:rPr>
-          <w:rFonts w:hint="eastAsia" w:ascii="Times New Roman" w:hAnsi="Times New Roman" w:eastAsia="FangSong" w:cs="Times New Roman"/>
-        </w:rPr>
-        <w:t xml:space="preserve">建立候选池</w:t>
-      </w:r>
-      <w:r>
-        <w:rPr>
-          <w:rFonts w:ascii="Times New Roman" w:hAnsi="Times New Roman" w:eastAsia="Times New Roman" w:cs="Times New Roman"/>
-        </w:rPr>
-        <w:t xml:space="preserve"> → </w:t>
-      </w:r>
-      <w:r>
-        <w:rPr>
-          <w:rFonts w:hint="eastAsia" w:ascii="Times New Roman" w:hAnsi="Times New Roman" w:eastAsia="FangSong" w:cs="Times New Roman"/>
-        </w:rPr>
-        <w:t xml:space="preserve">否定排除</w:t>
-      </w:r>
-      <w:r>
-        <w:rPr>
-          <w:rFonts w:ascii="Times New Roman" w:hAnsi="Times New Roman" w:eastAsia="Times New Roman" w:cs="Times New Roman"/>
-        </w:rPr>
-        <w:t xml:space="preserve"> → </w:t>
-      </w:r>
-      <w:r>
-        <w:rPr>
-          <w:rFonts w:hint="eastAsia" w:ascii="Times New Roman" w:hAnsi="Times New Roman" w:eastAsia="FangSong" w:cs="Times New Roman"/>
-        </w:rPr>
-        <w:t>反向闭环验证</w:t>
-      </w:r>
-      <w:r>
-        <w:rPr>
-          <w:rFonts w:hint="eastAsia" w:ascii="Times New Roman" w:hAnsi="Times New Roman" w:eastAsia="Times New Roman" w:cs="Times New Roman"/>
-        </w:rPr>
-        <w:t>）</w:t>
-      </w:r>
-    </w:p>
+        <w:tblBorders>
+          <w:top w:val="single" w:sz="12" w:space="0" w:color="333333"/>
+          <w:bottom w:val="single" w:sz="12" w:space="0" w:color="333333"/>
+          <w:left w:val="none"/>
+          <w:right w:val="none"/>
+          <w:insideH w:val="none"/>
+          <w:insideV w:val="none"/>
+        </w:tblBorders>
+      </w:tblPr>
+      <w:tblGrid>
+        <w:gridCol w:w="7920"/>
+      </w:tblGrid>
+      <w:tr>
+        <w:trPr>
+          <w:tblHeader w:val="on"/>
+        </w:trPr>
+        <w:tc>
+          <w:tcPr>
+            <w:tcBorders>
+              <w:bottom w:val="single" w:sz="6" w:space="0" w:color="333333"/>
+            </w:tcBorders>
+          </w:tcPr>
+          <w:p>
+            <w:pPr>
+              <w:pStyle w:val="Compact"/>
+              <w:jc w:val="center"/>
+            </w:pPr>
+            <w:r>
+              <w:rPr>
+                <w:rFonts w:hint="eastAsia" w:ascii="Times New Roman" w:hAnsi="Times New Roman" w:eastAsia="SimHei" w:cs="Times New Roman"/>
+                <w:b/>
+              </w:rPr>
+              <w:t>元素推断</w:t>
+            </w:r>
+            <w:r>
+              <w:rPr>
+                <w:rFonts w:hint="eastAsia" w:ascii="Times New Roman" w:hAnsi="Times New Roman" w:eastAsia="Times New Roman" w:cs="Times New Roman"/>
+                <w:b/>
+              </w:rPr>
+              <w:t>「</w:t>
+            </w:r>
+            <w:r>
+              <w:rPr>
+                <w:rFonts w:hint="eastAsia" w:ascii="Times New Roman" w:hAnsi="Times New Roman" w:eastAsia="SimHei" w:cs="Times New Roman"/>
+                <w:b/>
+              </w:rPr>
+              <w:t>四步法</w:t>
+            </w:r>
+            <w:r>
+              <w:rPr>
+                <w:rFonts w:hint="eastAsia" w:ascii="Times New Roman" w:hAnsi="Times New Roman" w:eastAsia="Times New Roman" w:cs="Times New Roman"/>
+                <w:b/>
+              </w:rPr>
+              <w:t>」</w:t>
+            </w:r>
+            <w:r>
+              <w:rPr>
+                <w:rFonts w:hint="eastAsia" w:ascii="Times New Roman" w:hAnsi="Times New Roman" w:eastAsia="SimHei" w:cs="Times New Roman"/>
+                <w:b/>
+              </w:rPr>
+              <w:t>决策闭环体系</w:t>
+            </w:r>
+          </w:p>
+        </w:tc>
+      </w:tr>
+      <w:tr>
+        <w:tc>
+          <w:tcPr/>
+          <w:p>
+            <w:pPr>
+              <w:pStyle w:val="Compact"/>
+              <w:jc w:val="center"/>
+            </w:pPr>
+            <w:r>
+              <w:rPr>
+                <w:rFonts w:ascii="Times New Roman" w:hAnsi="Times New Roman" w:eastAsia="Times New Roman" w:cs="Times New Roman"/>
+              </w:rPr>
+              <w:drawing>
+                <wp:inline>
+                  <wp:extent cx="2667000" cy="1171094"/>
+                  <wp:effectExtent b="0" l="0" r="0" t="0"/>
+                  <wp:docPr descr="" title="" id="11" name="Picture"/>
+                  <a:graphic>
+                    <a:graphicData uri="http://schemas.openxmlformats.org/drawingml/2006/picture">
+                      <pic:pic>
+                        <pic:nvPicPr>
+                          <pic:cNvPr descr="6f2f8853aa24c146e33ba4e84e2cbca183fbab4964453210fb26bf152a97604d.png" id="12" name="Picture"/>
+                          <pic:cNvPicPr>
+                            <a:picLocks noChangeArrowheads="1" noChangeAspect="1"/>
+                          </pic:cNvPicPr>
+                        </pic:nvPicPr>
+                        <pic:blipFill>
+                          <a:blip r:embed="rId10"/>
+                          <a:stretch>
+                            <a:fillRect/>
+                          </a:stretch>
+                        </pic:blipFill>
+                        <pic:spPr bwMode="auto">
+                          <a:xfrm>
+                            <a:off x="0" y="0"/>
+                            <a:ext cx="2667000" cy="1171094"/>
+                          </a:xfrm>
+                          <a:prstGeom prst="rect">
+                            <a:avLst/>
+                          </a:prstGeom>
+                          <a:noFill/>
+                          <a:ln w="9525">
+                            <a:noFill/>
+                            <a:headEnd/>
+                            <a:tailEnd/>
+                          </a:ln>
+                        </pic:spPr>
+                      </pic:pic>
+                    </a:graphicData>
+                  </a:graphic>
+                </wp:inline>
+              </w:drawing>
+            </w:r>
+          </w:p>
+        </w:tc>
+      </w:tr>
+      <w:tr>
+        <w:tc>
+          <w:tcPr/>
+          <w:p>
+            <w:pPr>
+              <w:pStyle w:val="Compact"/>
+              <w:jc w:val="center"/>
+            </w:pPr>
+            <w:r>
+              <w:rPr>
+                <w:rFonts w:ascii="Times New Roman" w:hAnsi="Times New Roman" w:eastAsia="Times New Roman" w:cs="Times New Roman"/>
+              </w:rPr>
+              <w:t xml:space="preserve">&gt; </w:t>
+            </w:r>
+            <w:r>
+              <w:rPr>
+                <w:rFonts w:hint="eastAsia" w:ascii="Times New Roman" w:hAnsi="Times New Roman" w:eastAsia="FangSong" w:cs="Times New Roman"/>
+              </w:rPr>
+              <w:t xml:space="preserve">图</w:t>
+            </w:r>
+            <w:r>
+              <w:rPr>
+                <w:rFonts w:ascii="Times New Roman" w:hAnsi="Times New Roman" w:eastAsia="Times New Roman" w:cs="Times New Roman"/>
+              </w:rPr>
+              <w:t xml:space="preserve"> </w:t>
+            </w:r>
+            <w:r>
+              <w:rPr>
+                <w:rFonts w:hint="eastAsia" w:ascii="Times New Roman" w:hAnsi="Times New Roman" w:eastAsia="Times New Roman" w:cs="Times New Roman"/>
+              </w:rPr>
+              <w:t>8-1：</w:t>
+            </w:r>
+            <w:r>
+              <w:rPr>
+                <w:rFonts w:hint="eastAsia" w:ascii="Times New Roman" w:hAnsi="Times New Roman" w:eastAsia="FangSong" w:cs="Times New Roman"/>
+              </w:rPr>
+              <w:t>元素推断</w:t>
+            </w:r>
+            <w:r>
+              <w:rPr>
+                <w:rFonts w:hint="eastAsia" w:ascii="Times New Roman" w:hAnsi="Times New Roman" w:eastAsia="Times New Roman" w:cs="Times New Roman"/>
+              </w:rPr>
+              <w:t>「</w:t>
+            </w:r>
+            <w:r>
+              <w:rPr>
+                <w:rFonts w:hint="eastAsia" w:ascii="Times New Roman" w:hAnsi="Times New Roman" w:eastAsia="FangSong" w:cs="Times New Roman"/>
+              </w:rPr>
+              <w:t>四步法</w:t>
+            </w:r>
+            <w:r>
+              <w:rPr>
+                <w:rFonts w:hint="eastAsia" w:ascii="Times New Roman" w:hAnsi="Times New Roman" w:eastAsia="Times New Roman" w:cs="Times New Roman"/>
+              </w:rPr>
+              <w:t>」</w:t>
+            </w:r>
+            <w:r>
+              <w:rPr>
+                <w:rFonts w:hint="eastAsia" w:ascii="Times New Roman" w:hAnsi="Times New Roman" w:eastAsia="FangSong" w:cs="Times New Roman"/>
+              </w:rPr>
+              <w:t>决策闭环体系</w:t>
+            </w:r>
+            <w:r>
+              <w:rPr>
+                <w:rFonts w:hint="eastAsia" w:ascii="Times New Roman" w:hAnsi="Times New Roman" w:eastAsia="Times New Roman" w:cs="Times New Roman"/>
+              </w:rPr>
+              <w:t>（</w:t>
+            </w:r>
+            <w:r>
+              <w:rPr>
+                <w:rFonts w:hint="eastAsia" w:ascii="Times New Roman" w:hAnsi="Times New Roman" w:eastAsia="FangSong" w:cs="Times New Roman"/>
+              </w:rPr>
+              <w:t>抓取信号</w:t>
+            </w:r>
+            <w:r>
+              <w:rPr>
+                <w:rFonts w:ascii="Times New Roman" w:hAnsi="Times New Roman" w:eastAsia="Times New Roman" w:cs="Times New Roman"/>
+              </w:rPr>
+              <w:t xml:space="preserve"> → </w:t>
+            </w:r>
+            <w:r>
+              <w:rPr>
+                <w:rFonts w:hint="eastAsia" w:ascii="Times New Roman" w:hAnsi="Times New Roman" w:eastAsia="FangSong" w:cs="Times New Roman"/>
+              </w:rPr>
+              <w:t xml:space="preserve">建立候选池</w:t>
+            </w:r>
+            <w:r>
+              <w:rPr>
+                <w:rFonts w:ascii="Times New Roman" w:hAnsi="Times New Roman" w:eastAsia="Times New Roman" w:cs="Times New Roman"/>
+              </w:rPr>
+              <w:t xml:space="preserve"> → </w:t>
+            </w:r>
+            <w:r>
+              <w:rPr>
+                <w:rFonts w:hint="eastAsia" w:ascii="Times New Roman" w:hAnsi="Times New Roman" w:eastAsia="FangSong" w:cs="Times New Roman"/>
+              </w:rPr>
+              <w:t xml:space="preserve">否定排除</w:t>
+            </w:r>
+            <w:r>
+              <w:rPr>
+                <w:rFonts w:ascii="Times New Roman" w:hAnsi="Times New Roman" w:eastAsia="Times New Roman" w:cs="Times New Roman"/>
+              </w:rPr>
+              <w:t xml:space="preserve"> → </w:t>
+            </w:r>
+            <w:r>
+              <w:rPr>
+                <w:rFonts w:hint="eastAsia" w:ascii="Times New Roman" w:hAnsi="Times New Roman" w:eastAsia="FangSong" w:cs="Times New Roman"/>
+              </w:rPr>
+              <w:t>反向闭环验证</w:t>
+            </w:r>
+            <w:r>
+              <w:rPr>
+                <w:rFonts w:hint="eastAsia" w:ascii="Times New Roman" w:hAnsi="Times New Roman" w:eastAsia="Times New Roman" w:cs="Times New Roman"/>
+              </w:rPr>
+              <w:t>）</w:t>
+            </w:r>
+          </w:p>
+        </w:tc>
+      </w:tr>
+    </w:tbl>
     <w:p>
       <w:pPr>
         <w:spacing w:before="160" w:after="80"/>
@@ -6341,6 +6424,7 @@
           <w:ilvl w:val="0"/>
           <w:numId w:val="1003"/>
         </w:numPr>
+        <w:spacing w:after="80"/>
         <w:ind w:firstLine="420"/>
       </w:pPr>
       <w:r>
@@ -6430,118 +6514,179 @@
         <w:t>。</w:t>
       </w:r>
     </w:p>
-    <w:p>
-      <w:pPr>
-        <w:pStyle w:val="FirstParagraph"/>
-        <w:spacing w:before="160" w:after="80"/>
+    <w:tbl>
+      <w:tblPr>
+        <w:tblStyle w:val="Table"/>
+        <w:tblW w:type="pct" w:w="5000"/>
+        <w:tblLayout w:type="fixed"/>
+        <w:tblLook w:firstRow="1" w:lastRow="0" w:firstColumn="0" w:lastColumn="0" w:noHBand="0" w:noVBand="0" w:val="0020"/>
         <w:jc w:val="center"/>
-      </w:pPr>
-      <w:r>
-        <w:rPr>
-          <w:rFonts w:ascii="Times New Roman" w:hAnsi="Times New Roman" w:eastAsia="Times New Roman" w:cs="Times New Roman"/>
-        </w:rPr>
-        <w:drawing>
-          <wp:inline>
-            <wp:extent cx="2667000" cy="682052"/>
-            <wp:effectExtent b="0" l="0" r="0" t="0"/>
-            <wp:docPr descr="" title="" id="18" name="Picture"/>
-            <a:graphic>
-              <a:graphicData uri="http://schemas.openxmlformats.org/drawingml/2006/picture">
-                <pic:pic>
-                  <pic:nvPicPr>
-                    <pic:cNvPr descr="513610b3927f42b644d3a4f0faa1affa98f0fc6919c119bac08b8855131b01d5.jpg" id="19" name="Picture"/>
-                    <pic:cNvPicPr>
-                      <a:picLocks noChangeArrowheads="1" noChangeAspect="1"/>
-                    </pic:cNvPicPr>
-                  </pic:nvPicPr>
-                  <pic:blipFill>
-                    <a:blip r:embed="rId17"/>
-                    <a:stretch>
-                      <a:fillRect/>
-                    </a:stretch>
-                  </pic:blipFill>
-                  <pic:spPr bwMode="auto">
-                    <a:xfrm>
-                      <a:off x="0" y="0"/>
-                      <a:ext cx="2667000" cy="682052"/>
-                    </a:xfrm>
-                    <a:prstGeom prst="rect">
-                      <a:avLst/>
-                    </a:prstGeom>
-                    <a:noFill/>
-                    <a:ln w="9525">
-                      <a:noFill/>
-                      <a:headEnd/>
-                      <a:tailEnd/>
-                    </a:ln>
-                  </pic:spPr>
-                </pic:pic>
-              </a:graphicData>
-            </a:graphic>
-          </wp:inline>
-        </w:drawing>
-      </w:r>
-      <w:r>
-        <w:rPr>
-          <w:rFonts w:ascii="Times New Roman" w:hAnsi="Times New Roman" w:eastAsia="Times New Roman" w:cs="Times New Roman"/>
-        </w:rPr>
-        <w:t xml:space="preserve"> </w:t>
-      </w:r>
-      <w:r>
-        <w:rPr>
-          <w:rFonts w:ascii="Times New Roman" w:hAnsi="Times New Roman" w:eastAsia="Times New Roman" w:cs="Times New Roman"/>
-        </w:rPr>
-        <w:t xml:space="preserve">&gt; </w:t>
-      </w:r>
-      <w:r>
-        <w:rPr>
-          <w:rFonts w:hint="eastAsia" w:ascii="Times New Roman" w:hAnsi="Times New Roman" w:eastAsia="FangSong" w:cs="Times New Roman"/>
-        </w:rPr>
-        <w:t xml:space="preserve">图</w:t>
-      </w:r>
-      <w:r>
-        <w:rPr>
-          <w:rFonts w:ascii="Times New Roman" w:hAnsi="Times New Roman" w:eastAsia="Times New Roman" w:cs="Times New Roman"/>
-        </w:rPr>
-        <w:t xml:space="preserve"> </w:t>
-      </w:r>
-      <w:r>
-        <w:rPr>
-          <w:rFonts w:hint="eastAsia" w:ascii="Times New Roman" w:hAnsi="Times New Roman" w:eastAsia="Times New Roman" w:cs="Times New Roman"/>
-        </w:rPr>
-        <w:t>8-2：</w:t>
-      </w:r>
-      <w:r>
-        <w:rPr>
-          <w:rFonts w:hint="eastAsia" w:ascii="Times New Roman" w:hAnsi="Times New Roman" w:eastAsia="FangSong" w:cs="Times New Roman"/>
-        </w:rPr>
-        <w:t>配位物颜色的条件依赖性实例</w:t>
-      </w:r>
-      <w:r>
-        <w:rPr>
-          <w:rFonts w:hint="eastAsia" w:ascii="Times New Roman" w:hAnsi="Times New Roman" w:eastAsia="Times New Roman" w:cs="Times New Roman"/>
-        </w:rPr>
-        <w:t>：Fe(III)-</w:t>
-      </w:r>
-      <w:r>
-        <w:rPr>
-          <w:rFonts w:hint="eastAsia" w:ascii="Times New Roman" w:hAnsi="Times New Roman" w:eastAsia="FangSong" w:cs="Times New Roman"/>
-        </w:rPr>
-        <w:t>水杨酸配合物随</w:t>
-      </w:r>
-      <w:r>
-        <w:rPr>
-          <w:rFonts w:ascii="Times New Roman" w:hAnsi="Times New Roman" w:eastAsia="Times New Roman" w:cs="Times New Roman"/>
-        </w:rPr>
-        <w:t xml:space="preserve"> pH </w:t>
-      </w:r>
-      <w:r>
-        <w:rPr>
-          <w:rFonts w:hint="eastAsia" w:ascii="Times New Roman" w:hAnsi="Times New Roman" w:eastAsia="FangSong" w:cs="Times New Roman"/>
-        </w:rPr>
-        <w:t xml:space="preserve">变化的配位数与特征颜色</w:t>
-      </w:r>
-    </w:p>
+        <w:tblBorders>
+          <w:top w:val="single" w:sz="12" w:space="0" w:color="333333"/>
+          <w:bottom w:val="single" w:sz="12" w:space="0" w:color="333333"/>
+          <w:left w:val="none"/>
+          <w:right w:val="none"/>
+          <w:insideH w:val="none"/>
+          <w:insideV w:val="none"/>
+        </w:tblBorders>
+      </w:tblPr>
+      <w:tblGrid>
+        <w:gridCol w:w="7920"/>
+      </w:tblGrid>
+      <w:tr>
+        <w:trPr>
+          <w:tblHeader w:val="on"/>
+        </w:trPr>
+        <w:tc>
+          <w:tcPr>
+            <w:tcBorders>
+              <w:bottom w:val="single" w:sz="6" w:space="0" w:color="333333"/>
+            </w:tcBorders>
+          </w:tcPr>
+          <w:p>
+            <w:pPr>
+              <w:pStyle w:val="Compact"/>
+              <w:jc w:val="center"/>
+            </w:pPr>
+            <w:r>
+              <w:rPr>
+                <w:rFonts w:hint="eastAsia" w:ascii="Times New Roman" w:hAnsi="Times New Roman" w:eastAsia="SimHei" w:cs="Times New Roman"/>
+                <w:b/>
+              </w:rPr>
+              <w:t>配位物颜色的条件依赖性实例</w:t>
+            </w:r>
+            <w:r>
+              <w:rPr>
+                <w:rFonts w:hint="eastAsia" w:ascii="Times New Roman" w:hAnsi="Times New Roman" w:eastAsia="Times New Roman" w:cs="Times New Roman"/>
+                <w:b/>
+              </w:rPr>
+              <w:t>：Fe(I</w:t>
+            </w:r>
+          </w:p>
+        </w:tc>
+      </w:tr>
+      <w:tr>
+        <w:tc>
+          <w:tcPr/>
+          <w:p>
+            <w:pPr>
+              <w:pStyle w:val="Compact"/>
+              <w:jc w:val="center"/>
+            </w:pPr>
+            <w:r>
+              <w:rPr>
+                <w:rFonts w:ascii="Times New Roman" w:hAnsi="Times New Roman" w:eastAsia="Times New Roman" w:cs="Times New Roman"/>
+              </w:rPr>
+              <w:drawing>
+                <wp:inline>
+                  <wp:extent cx="2667000" cy="682052"/>
+                  <wp:effectExtent b="0" l="0" r="0" t="0"/>
+                  <wp:docPr descr="" title="" id="18" name="Picture"/>
+                  <a:graphic>
+                    <a:graphicData uri="http://schemas.openxmlformats.org/drawingml/2006/picture">
+                      <pic:pic>
+                        <pic:nvPicPr>
+                          <pic:cNvPr descr="513610b3927f42b644d3a4f0faa1affa98f0fc6919c119bac08b8855131b01d5.jpg" id="19" name="Picture"/>
+                          <pic:cNvPicPr>
+                            <a:picLocks noChangeArrowheads="1" noChangeAspect="1"/>
+                          </pic:cNvPicPr>
+                        </pic:nvPicPr>
+                        <pic:blipFill>
+                          <a:blip r:embed="rId17"/>
+                          <a:stretch>
+                            <a:fillRect/>
+                          </a:stretch>
+                        </pic:blipFill>
+                        <pic:spPr bwMode="auto">
+                          <a:xfrm>
+                            <a:off x="0" y="0"/>
+                            <a:ext cx="2667000" cy="682052"/>
+                          </a:xfrm>
+                          <a:prstGeom prst="rect">
+                            <a:avLst/>
+                          </a:prstGeom>
+                          <a:noFill/>
+                          <a:ln w="9525">
+                            <a:noFill/>
+                            <a:headEnd/>
+                            <a:tailEnd/>
+                          </a:ln>
+                        </pic:spPr>
+                      </pic:pic>
+                    </a:graphicData>
+                  </a:graphic>
+                </wp:inline>
+              </w:drawing>
+            </w:r>
+          </w:p>
+        </w:tc>
+      </w:tr>
+      <w:tr>
+        <w:tc>
+          <w:tcPr/>
+          <w:p>
+            <w:pPr>
+              <w:pStyle w:val="Compact"/>
+              <w:jc w:val="center"/>
+            </w:pPr>
+            <w:r>
+              <w:rPr>
+                <w:rFonts w:ascii="Times New Roman" w:hAnsi="Times New Roman" w:eastAsia="Times New Roman" w:cs="Times New Roman"/>
+              </w:rPr>
+              <w:t xml:space="preserve">&gt; </w:t>
+            </w:r>
+            <w:r>
+              <w:rPr>
+                <w:rFonts w:hint="eastAsia" w:ascii="Times New Roman" w:hAnsi="Times New Roman" w:eastAsia="FangSong" w:cs="Times New Roman"/>
+              </w:rPr>
+              <w:t xml:space="preserve">图</w:t>
+            </w:r>
+            <w:r>
+              <w:rPr>
+                <w:rFonts w:ascii="Times New Roman" w:hAnsi="Times New Roman" w:eastAsia="Times New Roman" w:cs="Times New Roman"/>
+              </w:rPr>
+              <w:t xml:space="preserve"> </w:t>
+            </w:r>
+            <w:r>
+              <w:rPr>
+                <w:rFonts w:hint="eastAsia" w:ascii="Times New Roman" w:hAnsi="Times New Roman" w:eastAsia="Times New Roman" w:cs="Times New Roman"/>
+              </w:rPr>
+              <w:t>8-2：</w:t>
+            </w:r>
+            <w:r>
+              <w:rPr>
+                <w:rFonts w:hint="eastAsia" w:ascii="Times New Roman" w:hAnsi="Times New Roman" w:eastAsia="FangSong" w:cs="Times New Roman"/>
+              </w:rPr>
+              <w:t>配位物颜色的条件依赖性实例</w:t>
+            </w:r>
+            <w:r>
+              <w:rPr>
+                <w:rFonts w:hint="eastAsia" w:ascii="Times New Roman" w:hAnsi="Times New Roman" w:eastAsia="Times New Roman" w:cs="Times New Roman"/>
+              </w:rPr>
+              <w:t>：Fe(III)-</w:t>
+            </w:r>
+            <w:r>
+              <w:rPr>
+                <w:rFonts w:hint="eastAsia" w:ascii="Times New Roman" w:hAnsi="Times New Roman" w:eastAsia="FangSong" w:cs="Times New Roman"/>
+              </w:rPr>
+              <w:t>水杨酸配合物随</w:t>
+            </w:r>
+            <w:r>
+              <w:rPr>
+                <w:rFonts w:ascii="Times New Roman" w:hAnsi="Times New Roman" w:eastAsia="Times New Roman" w:cs="Times New Roman"/>
+              </w:rPr>
+              <w:t xml:space="preserve"> pH </w:t>
+            </w:r>
+            <w:r>
+              <w:rPr>
+                <w:rFonts w:hint="eastAsia" w:ascii="Times New Roman" w:hAnsi="Times New Roman" w:eastAsia="FangSong" w:cs="Times New Roman"/>
+              </w:rPr>
+              <w:t xml:space="preserve">变化的配位数与特征颜色</w:t>
+            </w:r>
+          </w:p>
+        </w:tc>
+      </w:tr>
+    </w:tbl>
     <w:p>
       <w:pPr>
         <w:spacing w:before="160" w:after="80"/>
@@ -6554,7 +6699,7 @@
     </w:p>
     <w:bookmarkEnd w:id="20"/>
     <w:bookmarkEnd w:id="21"/>
-    <w:bookmarkStart w:id="27" w:name="沉淀信号法与气体信号法"/>
+    <w:bookmarkStart w:id="24" w:name="沉淀信号法与气体信号法"/>
     <w:p>
       <w:pPr>
         <w:pStyle w:val="Heading2"/>
@@ -8839,7 +8984,7 @@
       </w:r>
     </w:p>
     <w:bookmarkEnd w:id="22"/>
-    <w:bookmarkStart w:id="26" w:name="气体信号"/>
+    <w:bookmarkStart w:id="23" w:name="气体信号"/>
     <w:p>
       <w:pPr>
         <w:pStyle w:val="Heading3"/>
@@ -10204,7 +10349,7 @@
     <w:p>
       <w:pPr>
         <w:pStyle w:val="BodyText"/>
-        <w:spacing w:before="120"/>
+        <w:spacing w:before="120" w:after="80"/>
         <w:ind w:firstLine="420"/>
       </w:pPr>
       <w:r>
@@ -10413,94 +10558,2059 @@
         <w:t xml:space="preserve">5）</w:t>
       </w:r>
     </w:p>
-    <w:p>
-      <w:pPr>
-        <w:pStyle w:val="BodyText"/>
-        <w:spacing w:before="160" w:after="80"/>
+    <w:tbl>
+      <w:tblPr>
+        <w:tblStyle w:val="Table"/>
+        <w:tblW w:type="pct" w:w="5000"/>
+        <w:tblLayout w:type="fixed"/>
+        <w:tblLook w:firstRow="1" w:lastRow="0" w:firstColumn="0" w:lastColumn="0" w:noHBand="0" w:noVBand="0" w:val="0020"/>
         <w:jc w:val="center"/>
-      </w:pPr>
-      <w:r>
-        <w:rPr>
-          <w:rFonts w:ascii="Times New Roman" w:hAnsi="Times New Roman" w:eastAsia="Times New Roman" w:cs="Times New Roman"/>
-        </w:rPr>
-        <w:drawing>
-          <wp:inline>
-            <wp:extent cx="2667000" cy="2168560"/>
-            <wp:effectExtent b="0" l="0" r="0" t="0"/>
-            <wp:docPr descr="" title="" id="24" name="Picture"/>
-            <a:graphic>
-              <a:graphicData uri="http://schemas.openxmlformats.org/drawingml/2006/picture">
-                <pic:pic>
-                  <pic:nvPicPr>
-                    <pic:cNvPr descr="2619f7aec28c2965baa10f8329da241f213d47a627cc65c53730239cc2b53fde.png" id="25" name="Picture"/>
-                    <pic:cNvPicPr>
-                      <a:picLocks noChangeArrowheads="1" noChangeAspect="1"/>
-                    </pic:cNvPicPr>
-                  </pic:nvPicPr>
-                  <pic:blipFill>
-                    <a:blip r:embed="rId23"/>
-                    <a:stretch>
-                      <a:fillRect/>
-                    </a:stretch>
-                  </pic:blipFill>
-                  <pic:spPr bwMode="auto">
-                    <a:xfrm>
-                      <a:off x="0" y="0"/>
-                      <a:ext cx="2667000" cy="2168560"/>
-                    </a:xfrm>
-                    <a:prstGeom prst="rect">
-                      <a:avLst/>
-                    </a:prstGeom>
-                    <a:noFill/>
-                    <a:ln w="9525">
-                      <a:noFill/>
-                      <a:headEnd/>
-                      <a:tailEnd/>
-                    </a:ln>
-                  </pic:spPr>
-                </pic:pic>
-              </a:graphicData>
-            </a:graphic>
-          </wp:inline>
-        </w:drawing>
-      </w:r>
-      <w:r>
-        <w:rPr>
-          <w:rFonts w:ascii="Times New Roman" w:hAnsi="Times New Roman" w:eastAsia="Times New Roman" w:cs="Times New Roman"/>
-        </w:rPr>
-        <w:t xml:space="preserve"> </w:t>
-      </w:r>
-      <w:r>
-        <w:rPr>
-          <w:rFonts w:ascii="Times New Roman" w:hAnsi="Times New Roman" w:eastAsia="Times New Roman" w:cs="Times New Roman"/>
-        </w:rPr>
-        <w:t xml:space="preserve">&gt; </w:t>
-      </w:r>
-      <w:r>
-        <w:rPr>
-          <w:rFonts w:hint="eastAsia" w:ascii="Times New Roman" w:hAnsi="Times New Roman" w:eastAsia="FangSong" w:cs="Times New Roman"/>
-        </w:rPr>
-        <w:t xml:space="preserve">图</w:t>
-      </w:r>
-      <w:r>
-        <w:rPr>
-          <w:rFonts w:ascii="Times New Roman" w:hAnsi="Times New Roman" w:eastAsia="Times New Roman" w:cs="Times New Roman"/>
-        </w:rPr>
-        <w:t xml:space="preserve"> </w:t>
-      </w:r>
-      <w:r>
-        <w:rPr>
-          <w:rFonts w:hint="eastAsia" w:ascii="Times New Roman" w:hAnsi="Times New Roman" w:eastAsia="Times New Roman" w:cs="Times New Roman"/>
-        </w:rPr>
-        <w:t>8-3：</w:t>
-      </w:r>
-      <w:r>
-        <w:rPr>
-          <w:rFonts w:hint="eastAsia" w:ascii="Times New Roman" w:hAnsi="Times New Roman" w:eastAsia="FangSong" w:cs="Times New Roman"/>
-        </w:rPr>
-        <w:t>化学竞赛常见气体特征信号速查表</w:t>
-      </w:r>
-    </w:p>
+        <w:tblBorders>
+          <w:top w:val="single" w:sz="12" w:space="0" w:color="333333"/>
+          <w:bottom w:val="single" w:sz="12" w:space="0" w:color="333333"/>
+          <w:left w:val="none"/>
+          <w:right w:val="none"/>
+          <w:insideH w:val="none"/>
+          <w:insideV w:val="none"/>
+        </w:tblBorders>
+      </w:tblPr>
+      <w:tblGrid>
+        <w:gridCol w:w="2084"/>
+        <w:gridCol w:w="2084"/>
+        <w:gridCol w:w="2084"/>
+        <w:gridCol w:w="1667"/>
+      </w:tblGrid>
+      <w:tr>
+        <w:trPr>
+          <w:tblHeader w:val="on"/>
+        </w:trPr>
+        <w:tc>
+          <w:tcPr>
+            <w:tcBorders>
+              <w:bottom w:val="single" w:sz="6" w:space="0" w:color="333333"/>
+            </w:tcBorders>
+          </w:tcPr>
+          <w:p>
+            <w:pPr>
+              <w:pStyle w:val="Compact"/>
+              <w:jc w:val="center"/>
+            </w:pPr>
+            <w:r>
+              <w:rPr>
+                <w:rFonts w:hint="eastAsia" w:ascii="Times New Roman" w:hAnsi="Times New Roman" w:eastAsia="SimHei" w:cs="Times New Roman"/>
+                <w:b/>
+              </w:rPr>
+              <w:t xml:space="preserve">气体</w:t>
+            </w:r>
+          </w:p>
+        </w:tc>
+        <w:tc>
+          <w:tcPr>
+            <w:tcBorders>
+              <w:bottom w:val="single" w:sz="6" w:space="0" w:color="333333"/>
+            </w:tcBorders>
+          </w:tcPr>
+          <w:p>
+            <w:pPr>
+              <w:pStyle w:val="Compact"/>
+              <w:jc w:val="center"/>
+            </w:pPr>
+            <w:r>
+              <w:rPr>
+                <w:rFonts w:hint="eastAsia" w:ascii="Times New Roman" w:hAnsi="Times New Roman" w:eastAsia="SimHei" w:cs="Times New Roman"/>
+                <w:b/>
+              </w:rPr>
+              <w:t xml:space="preserve">颜色</w:t>
+            </w:r>
+          </w:p>
+        </w:tc>
+        <w:tc>
+          <w:tcPr>
+            <w:tcBorders>
+              <w:bottom w:val="single" w:sz="6" w:space="0" w:color="333333"/>
+            </w:tcBorders>
+          </w:tcPr>
+          <w:p>
+            <w:pPr>
+              <w:pStyle w:val="Compact"/>
+              <w:jc w:val="center"/>
+            </w:pPr>
+            <w:r>
+              <w:rPr>
+                <w:rFonts w:hint="eastAsia" w:ascii="Times New Roman" w:hAnsi="Times New Roman" w:eastAsia="SimHei" w:cs="Times New Roman"/>
+                <w:b/>
+              </w:rPr>
+              <w:t xml:space="preserve">气味</w:t>
+            </w:r>
+          </w:p>
+        </w:tc>
+        <w:tc>
+          <w:tcPr>
+            <w:tcBorders>
+              <w:bottom w:val="single" w:sz="6" w:space="0" w:color="333333"/>
+            </w:tcBorders>
+          </w:tcPr>
+          <w:p>
+            <w:pPr>
+              <w:pStyle w:val="Compact"/>
+              <w:jc w:val="center"/>
+            </w:pPr>
+            <w:r>
+              <w:rPr>
+                <w:rFonts w:hint="eastAsia" w:ascii="Times New Roman" w:hAnsi="Times New Roman" w:eastAsia="SimHei" w:cs="Times New Roman"/>
+                <w:b/>
+              </w:rPr>
+              <w:t xml:space="preserve">特征反应或唯一性推断信息</w:t>
+            </w:r>
+          </w:p>
+        </w:tc>
+      </w:tr>
+      <w:tr>
+        <w:tc>
+          <w:tcPr/>
+          <w:p>
+            <w:pPr>
+              <w:pStyle w:val="Compact"/>
+              <w:jc w:val="center"/>
+            </w:pPr>
+            <m:oMath>
+              <m:r>
+                <m:rPr>
+                  <m:sty m:val="p"/>
+                </m:rPr>
+                <m:t>N</m:t>
+              </m:r>
+              <m:r>
+                <m:rPr>
+                  <m:sty m:val="p"/>
+                </m:rPr>
+                <m:t>O</m:t>
+              </m:r>
+            </m:oMath>
+            <w:r>
+              <w:rPr>
+                <w:rFonts w:ascii="Times New Roman" w:hAnsi="Times New Roman" w:eastAsia="Times New Roman" w:cs="Times New Roman"/>
+              </w:rPr>
+              <w:t xml:space="preserve">​</w:t>
+            </w:r>
+          </w:p>
+        </w:tc>
+        <w:tc>
+          <w:tcPr/>
+          <w:p>
+            <w:pPr>
+              <w:pStyle w:val="Compact"/>
+              <w:jc w:val="center"/>
+            </w:pPr>
+            <w:r>
+              <w:rPr>
+                <w:rFonts w:hint="eastAsia" w:ascii="Times New Roman" w:hAnsi="Times New Roman" w:eastAsia="FangSong" w:cs="Times New Roman"/>
+              </w:rPr>
+              <w:t xml:space="preserve">无色</w:t>
+            </w:r>
+          </w:p>
+        </w:tc>
+        <w:tc>
+          <w:tcPr/>
+          <w:p>
+            <w:pPr>
+              <w:pStyle w:val="Compact"/>
+              <w:jc w:val="center"/>
+            </w:pPr>
+            <w:r>
+              <w:rPr>
+                <w:rFonts w:hint="eastAsia" w:ascii="Times New Roman" w:hAnsi="Times New Roman" w:eastAsia="FangSong" w:cs="Times New Roman"/>
+              </w:rPr>
+              <w:t xml:space="preserve">无味</w:t>
+            </w:r>
+          </w:p>
+        </w:tc>
+        <w:tc>
+          <w:tcPr/>
+          <w:p>
+            <w:pPr>
+              <w:pStyle w:val="Compact"/>
+              <w:jc w:val="center"/>
+            </w:pPr>
+            <w:r>
+              <w:rPr>
+                <w:rFonts w:hint="eastAsia" w:ascii="Times New Roman" w:hAnsi="Times New Roman" w:eastAsia="FangSong" w:cs="Times New Roman"/>
+              </w:rPr>
+              <w:t>遇空气迅速变为红棕色</w:t>
+            </w:r>
+            <w:r>
+              <w:rPr>
+                <w:rFonts w:hint="eastAsia" w:ascii="Times New Roman" w:hAnsi="Times New Roman" w:eastAsia="Times New Roman" w:cs="Times New Roman"/>
+              </w:rPr>
+              <w:t>（</w:t>
+            </w:r>
+            <w:r>
+              <w:rPr>
+                <w:rFonts w:hint="eastAsia" w:ascii="Times New Roman" w:hAnsi="Times New Roman" w:eastAsia="FangSong" w:cs="Times New Roman"/>
+              </w:rPr>
+              <w:t>唯一</w:t>
+            </w:r>
+            <w:r>
+              <w:rPr>
+                <w:rFonts w:hint="eastAsia" w:ascii="Times New Roman" w:hAnsi="Times New Roman" w:eastAsia="Times New Roman" w:cs="Times New Roman"/>
+              </w:rPr>
+              <w:t>）</w:t>
+            </w:r>
+          </w:p>
+        </w:tc>
+      </w:tr>
+      <w:tr>
+        <w:tc>
+          <w:tcPr/>
+          <w:p>
+            <w:pPr>
+              <w:pStyle w:val="Compact"/>
+              <w:jc w:val="center"/>
+            </w:pPr>
+            <m:oMath>
+              <m:r>
+                <m:rPr>
+                  <m:sty m:val="p"/>
+                </m:rPr>
+                <m:t>N</m:t>
+              </m:r>
+              <m:sSub>
+                <m:e>
+                  <m:r>
+                    <m:rPr>
+                      <m:sty m:val="p"/>
+                    </m:rPr>
+                    <m:t>O</m:t>
+                  </m:r>
+                </m:e>
+                <m:sub>
+                  <m:r>
+                    <m:rPr>
+                      <m:sty m:val="p"/>
+                    </m:rPr>
+                    <m:t>2</m:t>
+                  </m:r>
+                </m:sub>
+              </m:sSub>
+            </m:oMath>
+            <w:r>
+              <w:rPr>
+                <w:rFonts w:ascii="Times New Roman" w:hAnsi="Times New Roman" w:eastAsia="Times New Roman" w:cs="Times New Roman"/>
+              </w:rPr>
+              <w:t xml:space="preserve">​</w:t>
+            </w:r>
+          </w:p>
+        </w:tc>
+        <w:tc>
+          <w:tcPr/>
+          <w:p>
+            <w:pPr>
+              <w:pStyle w:val="Compact"/>
+              <w:jc w:val="center"/>
+            </w:pPr>
+            <w:r>
+              <w:rPr>
+                <w:rFonts w:hint="eastAsia" w:ascii="Times New Roman" w:hAnsi="Times New Roman" w:eastAsia="FangSong" w:cs="Times New Roman"/>
+              </w:rPr>
+              <w:t xml:space="preserve">红棕色</w:t>
+            </w:r>
+          </w:p>
+        </w:tc>
+        <w:tc>
+          <w:tcPr/>
+          <w:p>
+            <w:pPr>
+              <w:pStyle w:val="Compact"/>
+              <w:jc w:val="center"/>
+            </w:pPr>
+            <w:r>
+              <w:rPr>
+                <w:rFonts w:hint="eastAsia" w:ascii="Times New Roman" w:hAnsi="Times New Roman" w:eastAsia="FangSong" w:cs="Times New Roman"/>
+              </w:rPr>
+              <w:t xml:space="preserve">刺激性</w:t>
+            </w:r>
+          </w:p>
+        </w:tc>
+        <w:tc>
+          <w:tcPr/>
+          <w:p>
+            <w:pPr>
+              <w:pStyle w:val="Compact"/>
+              <w:jc w:val="center"/>
+            </w:pPr>
+            <w:r>
+              <w:rPr>
+                <w:rFonts w:hint="eastAsia" w:ascii="Times New Roman" w:hAnsi="Times New Roman" w:eastAsia="FangSong" w:cs="Times New Roman"/>
+              </w:rPr>
+              <w:t xml:space="preserve">溶于水得无色气体</w:t>
+            </w:r>
+            <w:r>
+              <w:rPr>
+                <w:rFonts w:ascii="Times New Roman" w:hAnsi="Times New Roman" w:eastAsia="Times New Roman" w:cs="Times New Roman"/>
+              </w:rPr>
+              <w:t xml:space="preserve"> </w:t>
+            </w:r>
+            <m:oMath>
+              <m:r>
+                <m:rPr>
+                  <m:sty m:val="p"/>
+                </m:rPr>
+                <m:t>N</m:t>
+              </m:r>
+              <m:r>
+                <m:rPr>
+                  <m:sty m:val="p"/>
+                </m:rPr>
+                <m:t>O</m:t>
+              </m:r>
+            </m:oMath>
+            <w:r>
+              <w:rPr>
+                <w:rFonts w:ascii="Times New Roman" w:hAnsi="Times New Roman" w:eastAsia="Times New Roman" w:cs="Times New Roman"/>
+              </w:rPr>
+              <w:t xml:space="preserve"> </w:t>
+            </w:r>
+            <w:r>
+              <w:rPr>
+                <w:rFonts w:hint="eastAsia" w:ascii="Times New Roman" w:hAnsi="Times New Roman" w:eastAsia="FangSong" w:cs="Times New Roman"/>
+              </w:rPr>
+              <w:t xml:space="preserve">与硝酸</w:t>
+            </w:r>
+          </w:p>
+        </w:tc>
+      </w:tr>
+      <w:tr>
+        <w:tc>
+          <w:tcPr/>
+          <w:p>
+            <w:pPr>
+              <w:pStyle w:val="Compact"/>
+              <w:jc w:val="center"/>
+            </w:pPr>
+            <m:oMath>
+              <m:r>
+                <m:rPr>
+                  <m:sty m:val="p"/>
+                </m:rPr>
+                <m:t>S</m:t>
+              </m:r>
+              <m:sSub>
+                <m:e>
+                  <m:r>
+                    <m:rPr>
+                      <m:sty m:val="p"/>
+                    </m:rPr>
+                    <m:t>O</m:t>
+                  </m:r>
+                </m:e>
+                <m:sub>
+                  <m:r>
+                    <m:rPr>
+                      <m:sty m:val="p"/>
+                    </m:rPr>
+                    <m:t>2</m:t>
+                  </m:r>
+                </m:sub>
+              </m:sSub>
+            </m:oMath>
+            <w:r>
+              <w:rPr>
+                <w:rFonts w:ascii="Times New Roman" w:hAnsi="Times New Roman" w:eastAsia="Times New Roman" w:cs="Times New Roman"/>
+              </w:rPr>
+              <w:t xml:space="preserve">​</w:t>
+            </w:r>
+          </w:p>
+        </w:tc>
+        <w:tc>
+          <w:tcPr/>
+          <w:p>
+            <w:pPr>
+              <w:pStyle w:val="Compact"/>
+              <w:jc w:val="center"/>
+            </w:pPr>
+            <w:r>
+              <w:rPr>
+                <w:rFonts w:hint="eastAsia" w:ascii="Times New Roman" w:hAnsi="Times New Roman" w:eastAsia="FangSong" w:cs="Times New Roman"/>
+              </w:rPr>
+              <w:t xml:space="preserve">无色</w:t>
+            </w:r>
+          </w:p>
+        </w:tc>
+        <w:tc>
+          <w:tcPr/>
+          <w:p>
+            <w:pPr>
+              <w:pStyle w:val="Compact"/>
+              <w:jc w:val="center"/>
+            </w:pPr>
+            <w:r>
+              <w:rPr>
+                <w:rFonts w:hint="eastAsia" w:ascii="Times New Roman" w:hAnsi="Times New Roman" w:eastAsia="FangSong" w:cs="Times New Roman"/>
+              </w:rPr>
+              <w:t xml:space="preserve">刺激性</w:t>
+            </w:r>
+          </w:p>
+        </w:tc>
+        <w:tc>
+          <w:tcPr/>
+          <w:p>
+            <w:pPr>
+              <w:pStyle w:val="Compact"/>
+              <w:jc w:val="center"/>
+            </w:pPr>
+            <w:r>
+              <w:rPr>
+                <w:rFonts w:hint="eastAsia" w:ascii="Times New Roman" w:hAnsi="Times New Roman" w:eastAsia="FangSong" w:cs="Times New Roman"/>
+              </w:rPr>
+              <w:t>可逆漂白品红溶液</w:t>
+            </w:r>
+            <w:r>
+              <w:rPr>
+                <w:rFonts w:hint="eastAsia" w:ascii="Times New Roman" w:hAnsi="Times New Roman" w:eastAsia="Times New Roman" w:cs="Times New Roman"/>
+              </w:rPr>
+              <w:t>（</w:t>
+            </w:r>
+            <w:r>
+              <w:rPr>
+                <w:rFonts w:hint="eastAsia" w:ascii="Times New Roman" w:hAnsi="Times New Roman" w:eastAsia="FangSong" w:cs="Times New Roman"/>
+              </w:rPr>
+              <w:t>唯一</w:t>
+            </w:r>
+            <w:r>
+              <w:rPr>
+                <w:rFonts w:hint="eastAsia" w:ascii="Times New Roman" w:hAnsi="Times New Roman" w:eastAsia="Times New Roman" w:cs="Times New Roman"/>
+              </w:rPr>
+              <w:t>）</w:t>
+            </w:r>
+          </w:p>
+        </w:tc>
+      </w:tr>
+      <w:tr>
+        <w:tc>
+          <w:tcPr/>
+          <w:p>
+            <w:pPr>
+              <w:pStyle w:val="Compact"/>
+              <w:jc w:val="center"/>
+            </w:pPr>
+            <m:oMath>
+              <m:r>
+                <m:rPr>
+                  <m:sty m:val="p"/>
+                </m:rPr>
+                <m:t>C</m:t>
+              </m:r>
+              <m:sSub>
+                <m:e>
+                  <m:r>
+                    <m:rPr>
+                      <m:sty m:val="p"/>
+                    </m:rPr>
+                    <m:t>l</m:t>
+                  </m:r>
+                </m:e>
+                <m:sub>
+                  <m:r>
+                    <m:rPr>
+                      <m:sty m:val="p"/>
+                    </m:rPr>
+                    <m:t>2</m:t>
+                  </m:r>
+                </m:sub>
+              </m:sSub>
+            </m:oMath>
+            <w:r>
+              <w:rPr>
+                <w:rFonts w:ascii="Times New Roman" w:hAnsi="Times New Roman" w:eastAsia="Times New Roman" w:cs="Times New Roman"/>
+              </w:rPr>
+              <w:t xml:space="preserve">​</w:t>
+            </w:r>
+          </w:p>
+        </w:tc>
+        <w:tc>
+          <w:tcPr/>
+          <w:p>
+            <w:pPr>
+              <w:pStyle w:val="Compact"/>
+              <w:jc w:val="center"/>
+            </w:pPr>
+            <w:r>
+              <w:rPr>
+                <w:rFonts w:hint="eastAsia" w:ascii="Times New Roman" w:hAnsi="Times New Roman" w:eastAsia="FangSong" w:cs="Times New Roman"/>
+              </w:rPr>
+              <w:t xml:space="preserve">黄绿色</w:t>
+            </w:r>
+          </w:p>
+        </w:tc>
+        <w:tc>
+          <w:tcPr/>
+          <w:p>
+            <w:pPr>
+              <w:pStyle w:val="Compact"/>
+              <w:jc w:val="center"/>
+            </w:pPr>
+            <w:r>
+              <w:rPr>
+                <w:rFonts w:hint="eastAsia" w:ascii="Times New Roman" w:hAnsi="Times New Roman" w:eastAsia="FangSong" w:cs="Times New Roman"/>
+              </w:rPr>
+              <w:t xml:space="preserve">刺激性</w:t>
+            </w:r>
+          </w:p>
+        </w:tc>
+        <w:tc>
+          <w:tcPr/>
+          <w:p>
+            <w:pPr>
+              <w:pStyle w:val="Compact"/>
+              <w:jc w:val="center"/>
+            </w:pPr>
+            <w:r>
+              <w:rPr>
+                <w:rFonts w:hint="eastAsia" w:ascii="Times New Roman" w:hAnsi="Times New Roman" w:eastAsia="FangSong" w:cs="Times New Roman"/>
+              </w:rPr>
+              <w:t xml:space="preserve">使湿润的淀粉碘化钾试纸变蓝</w:t>
+            </w:r>
+          </w:p>
+        </w:tc>
+      </w:tr>
+      <w:tr>
+        <w:tc>
+          <w:tcPr/>
+          <w:p>
+            <w:pPr>
+              <w:pStyle w:val="Compact"/>
+              <w:jc w:val="center"/>
+            </w:pPr>
+            <m:oMath>
+              <m:r>
+                <m:rPr>
+                  <m:sty m:val="p"/>
+                </m:rPr>
+                <m:t>B</m:t>
+              </m:r>
+              <m:sSub>
+                <m:e>
+                  <m:r>
+                    <m:rPr>
+                      <m:sty m:val="p"/>
+                    </m:rPr>
+                    <m:t>r</m:t>
+                  </m:r>
+                </m:e>
+                <m:sub>
+                  <m:r>
+                    <m:rPr>
+                      <m:sty m:val="p"/>
+                    </m:rPr>
+                    <m:t>2</m:t>
+                  </m:r>
+                </m:sub>
+              </m:sSub>
+            </m:oMath>
+            <w:r>
+              <w:rPr>
+                <w:rFonts w:hint="eastAsia" w:ascii="Times New Roman" w:hAnsi="Times New Roman" w:eastAsia="Times New Roman" w:cs="Times New Roman"/>
+              </w:rPr>
+              <w:t>（</w:t>
+            </w:r>
+            <w:r>
+              <w:rPr>
+                <w:rFonts w:hint="eastAsia" w:ascii="Times New Roman" w:hAnsi="Times New Roman" w:eastAsia="FangSong" w:cs="Times New Roman"/>
+              </w:rPr>
+              <w:t>气</w:t>
+            </w:r>
+            <w:r>
+              <w:rPr>
+                <w:rFonts w:hint="eastAsia" w:ascii="Times New Roman" w:hAnsi="Times New Roman" w:eastAsia="Times New Roman" w:cs="Times New Roman"/>
+              </w:rPr>
+              <w:t>）</w:t>
+            </w:r>
+          </w:p>
+        </w:tc>
+        <w:tc>
+          <w:tcPr/>
+          <w:p>
+            <w:pPr>
+              <w:pStyle w:val="Compact"/>
+              <w:jc w:val="center"/>
+            </w:pPr>
+            <w:r>
+              <w:rPr>
+                <w:rFonts w:hint="eastAsia" w:ascii="Times New Roman" w:hAnsi="Times New Roman" w:eastAsia="FangSong" w:cs="Times New Roman"/>
+              </w:rPr>
+              <w:t xml:space="preserve">红棕色</w:t>
+            </w:r>
+          </w:p>
+        </w:tc>
+        <w:tc>
+          <w:tcPr/>
+          <w:p>
+            <w:pPr>
+              <w:pStyle w:val="Compact"/>
+              <w:jc w:val="center"/>
+            </w:pPr>
+            <w:r>
+              <w:rPr>
+                <w:rFonts w:hint="eastAsia" w:ascii="Times New Roman" w:hAnsi="Times New Roman" w:eastAsia="FangSong" w:cs="Times New Roman"/>
+              </w:rPr>
+              <w:t xml:space="preserve">刺激性</w:t>
+            </w:r>
+          </w:p>
+        </w:tc>
+        <w:tc>
+          <w:tcPr/>
+          <w:p>
+            <w:pPr>
+              <w:pStyle w:val="Compact"/>
+              <w:jc w:val="center"/>
+            </w:pPr>
+            <w:r>
+              <w:rPr>
+                <w:rFonts w:hint="eastAsia" w:ascii="Times New Roman" w:hAnsi="Times New Roman" w:eastAsia="FangSong" w:cs="Times New Roman"/>
+              </w:rPr>
+              <w:t>强氧化性</w:t>
+            </w:r>
+            <w:r>
+              <w:rPr>
+                <w:rFonts w:hint="eastAsia" w:ascii="Times New Roman" w:hAnsi="Times New Roman" w:eastAsia="Times New Roman" w:cs="Times New Roman"/>
+              </w:rPr>
+              <w:t>，</w:t>
+            </w:r>
+            <w:r>
+              <w:rPr>
+                <w:rFonts w:hint="eastAsia" w:ascii="Times New Roman" w:hAnsi="Times New Roman" w:eastAsia="FangSong" w:cs="Times New Roman"/>
+              </w:rPr>
+              <w:t>溶于有机溶剂呈橙红色</w:t>
+            </w:r>
+          </w:p>
+        </w:tc>
+      </w:tr>
+      <w:tr>
+        <w:tc>
+          <w:tcPr/>
+          <w:p>
+            <w:pPr>
+              <w:pStyle w:val="Compact"/>
+              <w:jc w:val="center"/>
+            </w:pPr>
+            <m:oMath>
+              <m:sSub>
+                <m:e>
+                  <m:r>
+                    <m:rPr>
+                      <m:sty m:val="p"/>
+                    </m:rPr>
+                    <m:t>I</m:t>
+                  </m:r>
+                </m:e>
+                <m:sub>
+                  <m:r>
+                    <m:rPr>
+                      <m:sty m:val="p"/>
+                    </m:rPr>
+                    <m:t>2</m:t>
+                  </m:r>
+                </m:sub>
+              </m:sSub>
+            </m:oMath>
+            <w:r>
+              <w:rPr>
+                <w:rFonts w:hint="eastAsia" w:ascii="Times New Roman" w:hAnsi="Times New Roman" w:eastAsia="Times New Roman" w:cs="Times New Roman"/>
+              </w:rPr>
+              <w:t>（</w:t>
+            </w:r>
+            <w:r>
+              <w:rPr>
+                <w:rFonts w:hint="eastAsia" w:ascii="Times New Roman" w:hAnsi="Times New Roman" w:eastAsia="FangSong" w:cs="Times New Roman"/>
+              </w:rPr>
+              <w:t>气</w:t>
+            </w:r>
+            <w:r>
+              <w:rPr>
+                <w:rFonts w:hint="eastAsia" w:ascii="Times New Roman" w:hAnsi="Times New Roman" w:eastAsia="Times New Roman" w:cs="Times New Roman"/>
+              </w:rPr>
+              <w:t>）</w:t>
+            </w:r>
+          </w:p>
+        </w:tc>
+        <w:tc>
+          <w:tcPr/>
+          <w:p>
+            <w:pPr>
+              <w:pStyle w:val="Compact"/>
+              <w:jc w:val="center"/>
+            </w:pPr>
+            <w:r>
+              <w:rPr>
+                <w:rFonts w:hint="eastAsia" w:ascii="Times New Roman" w:hAnsi="Times New Roman" w:eastAsia="FangSong" w:cs="Times New Roman"/>
+              </w:rPr>
+              <w:t xml:space="preserve">紫红色</w:t>
+            </w:r>
+          </w:p>
+        </w:tc>
+        <w:tc>
+          <w:tcPr/>
+          <w:p>
+            <w:pPr>
+              <w:pStyle w:val="Compact"/>
+              <w:jc w:val="center"/>
+            </w:pPr>
+            <w:r>
+              <w:rPr>
+                <w:rFonts w:hint="eastAsia" w:ascii="Times New Roman" w:hAnsi="Times New Roman" w:eastAsia="FangSong" w:cs="Times New Roman"/>
+              </w:rPr>
+              <w:t xml:space="preserve">刺激性</w:t>
+            </w:r>
+          </w:p>
+        </w:tc>
+        <w:tc>
+          <w:tcPr/>
+          <w:p>
+            <w:pPr>
+              <w:pStyle w:val="Compact"/>
+              <w:jc w:val="center"/>
+            </w:pPr>
+            <w:r>
+              <w:rPr>
+                <w:rFonts w:hint="eastAsia" w:ascii="Times New Roman" w:hAnsi="Times New Roman" w:eastAsia="FangSong" w:cs="Times New Roman"/>
+              </w:rPr>
+              <w:t>遇淀粉显蓝色</w:t>
+            </w:r>
+            <w:r>
+              <w:rPr>
+                <w:rFonts w:hint="eastAsia" w:ascii="Times New Roman" w:hAnsi="Times New Roman" w:eastAsia="Times New Roman" w:cs="Times New Roman"/>
+              </w:rPr>
+              <w:t>，</w:t>
+            </w:r>
+            <w:r>
+              <w:rPr>
+                <w:rFonts w:hint="eastAsia" w:ascii="Times New Roman" w:hAnsi="Times New Roman" w:eastAsia="FangSong" w:cs="Times New Roman"/>
+              </w:rPr>
+              <w:t>易升华</w:t>
+            </w:r>
+          </w:p>
+        </w:tc>
+      </w:tr>
+      <w:tr>
+        <w:tc>
+          <w:tcPr/>
+          <w:p>
+            <w:pPr>
+              <w:pStyle w:val="Compact"/>
+              <w:jc w:val="center"/>
+            </w:pPr>
+            <m:oMath>
+              <m:sSub>
+                <m:e>
+                  <m:r>
+                    <m:rPr>
+                      <m:sty m:val="p"/>
+                    </m:rPr>
+                    <m:t>F</m:t>
+                  </m:r>
+                </m:e>
+                <m:sub>
+                  <m:r>
+                    <m:rPr>
+                      <m:sty m:val="p"/>
+                    </m:rPr>
+                    <m:t>2</m:t>
+                  </m:r>
+                </m:sub>
+              </m:sSub>
+            </m:oMath>
+            <w:r>
+              <w:rPr>
+                <w:rFonts w:ascii="Times New Roman" w:hAnsi="Times New Roman" w:eastAsia="Times New Roman" w:cs="Times New Roman"/>
+              </w:rPr>
+              <w:t xml:space="preserve">​</w:t>
+            </w:r>
+          </w:p>
+        </w:tc>
+        <w:tc>
+          <w:tcPr/>
+          <w:p>
+            <w:pPr>
+              <w:pStyle w:val="Compact"/>
+              <w:jc w:val="center"/>
+            </w:pPr>
+            <w:r>
+              <w:rPr>
+                <w:rFonts w:hint="eastAsia" w:ascii="Times New Roman" w:hAnsi="Times New Roman" w:eastAsia="FangSong" w:cs="Times New Roman"/>
+              </w:rPr>
+              <w:t xml:space="preserve">淡黄绿色</w:t>
+            </w:r>
+          </w:p>
+        </w:tc>
+        <w:tc>
+          <w:tcPr/>
+          <w:p>
+            <w:pPr>
+              <w:pStyle w:val="Compact"/>
+              <w:jc w:val="center"/>
+            </w:pPr>
+            <w:r>
+              <w:rPr>
+                <w:rFonts w:hint="eastAsia" w:ascii="Times New Roman" w:hAnsi="Times New Roman" w:eastAsia="FangSong" w:cs="Times New Roman"/>
+              </w:rPr>
+              <w:t xml:space="preserve">刺激性</w:t>
+            </w:r>
+          </w:p>
+        </w:tc>
+        <w:tc>
+          <w:tcPr/>
+          <w:p>
+            <w:pPr>
+              <w:pStyle w:val="Compact"/>
+              <w:jc w:val="center"/>
+            </w:pPr>
+            <w:r>
+              <w:rPr>
+                <w:rFonts w:hint="eastAsia" w:ascii="Times New Roman" w:hAnsi="Times New Roman" w:eastAsia="FangSong" w:cs="Times New Roman"/>
+              </w:rPr>
+              <w:t xml:space="preserve">与水剧烈反应放出</w:t>
+            </w:r>
+            <w:r>
+              <w:rPr>
+                <w:rFonts w:ascii="Times New Roman" w:hAnsi="Times New Roman" w:eastAsia="Times New Roman" w:cs="Times New Roman"/>
+              </w:rPr>
+              <w:t xml:space="preserve"> </w:t>
+            </w:r>
+            <m:oMath>
+              <m:sSub>
+                <m:e>
+                  <m:r>
+                    <m:rPr>
+                      <m:sty m:val="p"/>
+                    </m:rPr>
+                    <m:t>O</m:t>
+                  </m:r>
+                </m:e>
+                <m:sub>
+                  <m:r>
+                    <m:rPr>
+                      <m:sty m:val="p"/>
+                    </m:rPr>
+                    <m:t>2</m:t>
+                  </m:r>
+                </m:sub>
+              </m:sSub>
+            </m:oMath>
+            <w:r>
+              <w:rPr>
+                <w:rFonts w:hint="eastAsia" w:ascii="Times New Roman" w:hAnsi="Times New Roman" w:eastAsia="Times New Roman" w:cs="Times New Roman"/>
+              </w:rPr>
+              <w:t>，</w:t>
+            </w:r>
+            <w:r>
+              <w:rPr>
+                <w:rFonts w:hint="eastAsia" w:ascii="Times New Roman" w:hAnsi="Times New Roman" w:eastAsia="FangSong" w:cs="Times New Roman"/>
+              </w:rPr>
+              <w:t>氧化性极强</w:t>
+            </w:r>
+          </w:p>
+        </w:tc>
+      </w:tr>
+      <w:tr>
+        <w:tc>
+          <w:tcPr/>
+          <w:p>
+            <w:pPr>
+              <w:pStyle w:val="Compact"/>
+              <w:jc w:val="center"/>
+            </w:pPr>
+            <m:oMath>
+              <m:sSub>
+                <m:e>
+                  <m:r>
+                    <m:rPr>
+                      <m:sty m:val="p"/>
+                    </m:rPr>
+                    <m:t>H</m:t>
+                  </m:r>
+                </m:e>
+                <m:sub>
+                  <m:r>
+                    <m:rPr>
+                      <m:sty m:val="p"/>
+                    </m:rPr>
+                    <m:t>2</m:t>
+                  </m:r>
+                </m:sub>
+              </m:sSub>
+              <m:r>
+                <m:rPr>
+                  <m:sty m:val="p"/>
+                </m:rPr>
+                <m:t>S</m:t>
+              </m:r>
+            </m:oMath>
+            <w:r>
+              <w:rPr>
+                <w:rFonts w:ascii="Times New Roman" w:hAnsi="Times New Roman" w:eastAsia="Times New Roman" w:cs="Times New Roman"/>
+              </w:rPr>
+              <w:t xml:space="preserve">​</w:t>
+            </w:r>
+          </w:p>
+        </w:tc>
+        <w:tc>
+          <w:tcPr/>
+          <w:p>
+            <w:pPr>
+              <w:pStyle w:val="Compact"/>
+              <w:jc w:val="center"/>
+            </w:pPr>
+            <w:r>
+              <w:rPr>
+                <w:rFonts w:hint="eastAsia" w:ascii="Times New Roman" w:hAnsi="Times New Roman" w:eastAsia="FangSong" w:cs="Times New Roman"/>
+              </w:rPr>
+              <w:t xml:space="preserve">无色</w:t>
+            </w:r>
+          </w:p>
+        </w:tc>
+        <w:tc>
+          <w:tcPr/>
+          <w:p>
+            <w:pPr>
+              <w:pStyle w:val="Compact"/>
+              <w:jc w:val="center"/>
+            </w:pPr>
+            <w:r>
+              <w:rPr>
+                <w:rFonts w:hint="eastAsia" w:ascii="Times New Roman" w:hAnsi="Times New Roman" w:eastAsia="FangSong" w:cs="Times New Roman"/>
+              </w:rPr>
+              <w:t xml:space="preserve">臭鸡蛋味</w:t>
+            </w:r>
+          </w:p>
+        </w:tc>
+        <w:tc>
+          <w:tcPr/>
+          <w:p>
+            <w:pPr>
+              <w:pStyle w:val="Compact"/>
+              <w:jc w:val="center"/>
+            </w:pPr>
+            <w:r>
+              <w:rPr>
+                <w:rFonts w:hint="eastAsia" w:ascii="Times New Roman" w:hAnsi="Times New Roman" w:eastAsia="FangSong" w:cs="Times New Roman"/>
+              </w:rPr>
+              <w:t xml:space="preserve">遇</w:t>
+            </w:r>
+            <w:r>
+              <w:rPr>
+                <w:rFonts w:ascii="Times New Roman" w:hAnsi="Times New Roman" w:eastAsia="Times New Roman" w:cs="Times New Roman"/>
+              </w:rPr>
+              <w:t xml:space="preserve"> </w:t>
+            </w:r>
+            <m:oMath>
+              <m:r>
+                <m:rPr>
+                  <m:sty m:val="p"/>
+                </m:rPr>
+                <m:t>P</m:t>
+              </m:r>
+              <m:sSup>
+                <m:e>
+                  <m:r>
+                    <m:rPr>
+                      <m:sty m:val="p"/>
+                    </m:rPr>
+                    <m:t>b</m:t>
+                  </m:r>
+                </m:e>
+                <m:sup>
+                  <m:r>
+                    <m:rPr>
+                      <m:sty m:val="p"/>
+                    </m:rPr>
+                    <m:t>2</m:t>
+                  </m:r>
+                  <m:r>
+                    <m:rPr>
+                      <m:sty m:val="p"/>
+                    </m:rPr>
+                    <m:t>+</m:t>
+                  </m:r>
+                </m:sup>
+              </m:sSup>
+            </m:oMath>
+            <w:r>
+              <w:rPr>
+                <w:rFonts w:ascii="Times New Roman" w:hAnsi="Times New Roman" w:eastAsia="Times New Roman" w:cs="Times New Roman"/>
+              </w:rPr>
+              <w:t xml:space="preserve">、</w:t>
+            </w:r>
+            <m:oMath>
+              <m:r>
+                <m:rPr>
+                  <m:sty m:val="p"/>
+                </m:rPr>
+                <m:t>C</m:t>
+              </m:r>
+              <m:sSup>
+                <m:e>
+                  <m:r>
+                    <m:rPr>
+                      <m:sty m:val="p"/>
+                    </m:rPr>
+                    <m:t>u</m:t>
+                  </m:r>
+                </m:e>
+                <m:sup>
+                  <m:r>
+                    <m:rPr>
+                      <m:sty m:val="p"/>
+                    </m:rPr>
+                    <m:t>2</m:t>
+                  </m:r>
+                  <m:r>
+                    <m:rPr>
+                      <m:sty m:val="p"/>
+                    </m:rPr>
+                    <m:t>+</m:t>
+                  </m:r>
+                </m:sup>
+              </m:sSup>
+            </m:oMath>
+            <w:r>
+              <w:rPr>
+                <w:rFonts w:ascii="Times New Roman" w:hAnsi="Times New Roman" w:eastAsia="Times New Roman" w:cs="Times New Roman"/>
+              </w:rPr>
+              <w:t xml:space="preserve"> </w:t>
+            </w:r>
+            <w:r>
+              <w:rPr>
+                <w:rFonts w:hint="eastAsia" w:ascii="Times New Roman" w:hAnsi="Times New Roman" w:eastAsia="FangSong" w:cs="Times New Roman"/>
+              </w:rPr>
+              <w:t xml:space="preserve">生成黑色硫化物沉淀</w:t>
+            </w:r>
+          </w:p>
+        </w:tc>
+      </w:tr>
+      <w:tr>
+        <w:tc>
+          <w:tcPr/>
+          <w:p>
+            <w:pPr>
+              <w:pStyle w:val="Compact"/>
+              <w:jc w:val="center"/>
+            </w:pPr>
+            <m:oMath>
+              <m:r>
+                <m:rPr>
+                  <m:sty m:val="p"/>
+                </m:rPr>
+                <m:t>N</m:t>
+              </m:r>
+              <m:sSub>
+                <m:e>
+                  <m:r>
+                    <m:rPr>
+                      <m:sty m:val="p"/>
+                    </m:rPr>
+                    <m:t>H</m:t>
+                  </m:r>
+                </m:e>
+                <m:sub>
+                  <m:r>
+                    <m:rPr>
+                      <m:sty m:val="p"/>
+                    </m:rPr>
+                    <m:t>3</m:t>
+                  </m:r>
+                </m:sub>
+              </m:sSub>
+            </m:oMath>
+            <w:r>
+              <w:rPr>
+                <w:rFonts w:ascii="Times New Roman" w:hAnsi="Times New Roman" w:eastAsia="Times New Roman" w:cs="Times New Roman"/>
+              </w:rPr>
+              <w:t xml:space="preserve">​</w:t>
+            </w:r>
+          </w:p>
+        </w:tc>
+        <w:tc>
+          <w:tcPr/>
+          <w:p>
+            <w:pPr>
+              <w:pStyle w:val="Compact"/>
+              <w:jc w:val="center"/>
+            </w:pPr>
+            <w:r>
+              <w:rPr>
+                <w:rFonts w:hint="eastAsia" w:ascii="Times New Roman" w:hAnsi="Times New Roman" w:eastAsia="FangSong" w:cs="Times New Roman"/>
+              </w:rPr>
+              <w:t xml:space="preserve">无色</w:t>
+            </w:r>
+          </w:p>
+        </w:tc>
+        <w:tc>
+          <w:tcPr/>
+          <w:p>
+            <w:pPr>
+              <w:pStyle w:val="Compact"/>
+              <w:jc w:val="center"/>
+            </w:pPr>
+            <w:r>
+              <w:rPr>
+                <w:rFonts w:hint="eastAsia" w:ascii="Times New Roman" w:hAnsi="Times New Roman" w:eastAsia="FangSong" w:cs="Times New Roman"/>
+              </w:rPr>
+              <w:t xml:space="preserve">氨臭味</w:t>
+            </w:r>
+          </w:p>
+        </w:tc>
+        <w:tc>
+          <w:tcPr/>
+          <w:p>
+            <w:pPr>
+              <w:pStyle w:val="Compact"/>
+              <w:jc w:val="center"/>
+            </w:pPr>
+            <w:r>
+              <w:rPr>
+                <w:rFonts w:hint="eastAsia" w:ascii="Times New Roman" w:hAnsi="Times New Roman" w:eastAsia="FangSong" w:cs="Times New Roman"/>
+              </w:rPr>
+              <w:t>使湿润红色石蕊试纸变蓝</w:t>
+            </w:r>
+            <w:r>
+              <w:rPr>
+                <w:rFonts w:hint="eastAsia" w:ascii="Times New Roman" w:hAnsi="Times New Roman" w:eastAsia="Times New Roman" w:cs="Times New Roman"/>
+              </w:rPr>
+              <w:t>，</w:t>
+            </w:r>
+            <w:r>
+              <w:rPr>
+                <w:rFonts w:hint="eastAsia" w:ascii="Times New Roman" w:hAnsi="Times New Roman" w:eastAsia="FangSong" w:cs="Times New Roman"/>
+              </w:rPr>
+              <w:t>遇挥发性酸生白烟</w:t>
+            </w:r>
+          </w:p>
+        </w:tc>
+      </w:tr>
+      <w:tr>
+        <w:tc>
+          <w:tcPr/>
+          <w:p>
+            <w:pPr>
+              <w:pStyle w:val="Compact"/>
+              <w:jc w:val="center"/>
+            </w:pPr>
+            <m:oMath>
+              <m:r>
+                <m:rPr>
+                  <m:sty m:val="p"/>
+                </m:rPr>
+                <m:t>H</m:t>
+              </m:r>
+              <m:r>
+                <m:rPr>
+                  <m:sty m:val="p"/>
+                </m:rPr>
+                <m:t>C</m:t>
+              </m:r>
+              <m:r>
+                <m:rPr>
+                  <m:sty m:val="p"/>
+                </m:rPr>
+                <m:t>l</m:t>
+              </m:r>
+            </m:oMath>
+            <w:r>
+              <w:rPr>
+                <w:rFonts w:ascii="Times New Roman" w:hAnsi="Times New Roman" w:eastAsia="Times New Roman" w:cs="Times New Roman"/>
+              </w:rPr>
+              <w:t xml:space="preserve">​</w:t>
+            </w:r>
+          </w:p>
+        </w:tc>
+        <w:tc>
+          <w:tcPr/>
+          <w:p>
+            <w:pPr>
+              <w:pStyle w:val="Compact"/>
+              <w:jc w:val="center"/>
+            </w:pPr>
+            <w:r>
+              <w:rPr>
+                <w:rFonts w:hint="eastAsia" w:ascii="Times New Roman" w:hAnsi="Times New Roman" w:eastAsia="FangSong" w:cs="Times New Roman"/>
+              </w:rPr>
+              <w:t xml:space="preserve">无色</w:t>
+            </w:r>
+          </w:p>
+        </w:tc>
+        <w:tc>
+          <w:tcPr/>
+          <w:p>
+            <w:pPr>
+              <w:pStyle w:val="Compact"/>
+              <w:jc w:val="center"/>
+            </w:pPr>
+            <w:r>
+              <w:rPr>
+                <w:rFonts w:hint="eastAsia" w:ascii="Times New Roman" w:hAnsi="Times New Roman" w:eastAsia="FangSong" w:cs="Times New Roman"/>
+              </w:rPr>
+              <w:t xml:space="preserve">刺激性</w:t>
+            </w:r>
+          </w:p>
+        </w:tc>
+        <w:tc>
+          <w:tcPr/>
+          <w:p>
+            <w:pPr>
+              <w:pStyle w:val="Compact"/>
+              <w:jc w:val="center"/>
+            </w:pPr>
+            <w:r>
+              <w:rPr>
+                <w:rFonts w:hint="eastAsia" w:ascii="Times New Roman" w:hAnsi="Times New Roman" w:eastAsia="FangSong" w:cs="Times New Roman"/>
+              </w:rPr>
+              <w:t>极易溶于水</w:t>
+            </w:r>
+            <w:r>
+              <w:rPr>
+                <w:rFonts w:hint="eastAsia" w:ascii="Times New Roman" w:hAnsi="Times New Roman" w:eastAsia="Times New Roman" w:cs="Times New Roman"/>
+              </w:rPr>
+              <w:t>，</w:t>
+            </w:r>
+            <w:r>
+              <w:rPr>
+                <w:rFonts w:hint="eastAsia" w:ascii="Times New Roman" w:hAnsi="Times New Roman" w:eastAsia="FangSong" w:cs="Times New Roman"/>
+              </w:rPr>
+              <w:t>在湿润空气中产生白雾</w:t>
+            </w:r>
+          </w:p>
+        </w:tc>
+      </w:tr>
+      <w:tr>
+        <w:tc>
+          <w:tcPr/>
+          <w:p>
+            <w:pPr>
+              <w:pStyle w:val="Compact"/>
+              <w:jc w:val="center"/>
+            </w:pPr>
+            <m:oMath>
+              <m:r>
+                <m:rPr>
+                  <m:sty m:val="p"/>
+                </m:rPr>
+                <m:t>H</m:t>
+              </m:r>
+              <m:r>
+                <m:rPr>
+                  <m:sty m:val="p"/>
+                </m:rPr>
+                <m:t>C</m:t>
+              </m:r>
+              <m:r>
+                <m:rPr>
+                  <m:sty m:val="p"/>
+                </m:rPr>
+                <m:t>N</m:t>
+              </m:r>
+            </m:oMath>
+            <w:r>
+              <w:rPr>
+                <w:rFonts w:ascii="Times New Roman" w:hAnsi="Times New Roman" w:eastAsia="Times New Roman" w:cs="Times New Roman"/>
+              </w:rPr>
+              <w:t xml:space="preserve">​</w:t>
+            </w:r>
+          </w:p>
+        </w:tc>
+        <w:tc>
+          <w:tcPr/>
+          <w:p>
+            <w:pPr>
+              <w:pStyle w:val="Compact"/>
+              <w:jc w:val="center"/>
+            </w:pPr>
+            <w:r>
+              <w:rPr>
+                <w:rFonts w:hint="eastAsia" w:ascii="Times New Roman" w:hAnsi="Times New Roman" w:eastAsia="FangSong" w:cs="Times New Roman"/>
+              </w:rPr>
+              <w:t xml:space="preserve">无色</w:t>
+            </w:r>
+          </w:p>
+        </w:tc>
+        <w:tc>
+          <w:tcPr/>
+          <w:p>
+            <w:pPr>
+              <w:pStyle w:val="Compact"/>
+              <w:jc w:val="center"/>
+            </w:pPr>
+            <w:r>
+              <w:rPr>
+                <w:rFonts w:hint="eastAsia" w:ascii="Times New Roman" w:hAnsi="Times New Roman" w:eastAsia="FangSong" w:cs="Times New Roman"/>
+              </w:rPr>
+              <w:t xml:space="preserve">苦杏仁味</w:t>
+            </w:r>
+          </w:p>
+        </w:tc>
+        <w:tc>
+          <w:tcPr/>
+          <w:p>
+            <w:pPr>
+              <w:pStyle w:val="Compact"/>
+              <w:jc w:val="center"/>
+            </w:pPr>
+            <w:r>
+              <w:rPr>
+                <w:rFonts w:hint="eastAsia" w:ascii="Times New Roman" w:hAnsi="Times New Roman" w:eastAsia="FangSong" w:cs="Times New Roman"/>
+              </w:rPr>
+              <w:t>剧毒</w:t>
+            </w:r>
+            <w:r>
+              <w:rPr>
+                <w:rFonts w:hint="eastAsia" w:ascii="Times New Roman" w:hAnsi="Times New Roman" w:eastAsia="Times New Roman" w:cs="Times New Roman"/>
+              </w:rPr>
+              <w:t>，</w:t>
+            </w:r>
+            <w:r>
+              <w:rPr>
+                <w:rFonts w:hint="eastAsia" w:ascii="Times New Roman" w:hAnsi="Times New Roman" w:eastAsia="FangSong" w:cs="Times New Roman"/>
+              </w:rPr>
+              <w:t>溶于水为弱酸</w:t>
+            </w:r>
+          </w:p>
+        </w:tc>
+      </w:tr>
+      <w:tr>
+        <w:tc>
+          <w:tcPr/>
+          <w:p>
+            <w:pPr>
+              <w:pStyle w:val="Compact"/>
+              <w:jc w:val="center"/>
+            </w:pPr>
+            <m:oMath>
+              <m:r>
+                <m:rPr>
+                  <m:sty m:val="p"/>
+                </m:rPr>
+                <m:t>P</m:t>
+              </m:r>
+              <m:sSub>
+                <m:e>
+                  <m:r>
+                    <m:rPr>
+                      <m:sty m:val="p"/>
+                    </m:rPr>
+                    <m:t>H</m:t>
+                  </m:r>
+                </m:e>
+                <m:sub>
+                  <m:r>
+                    <m:rPr>
+                      <m:sty m:val="p"/>
+                    </m:rPr>
+                    <m:t>3</m:t>
+                  </m:r>
+                </m:sub>
+              </m:sSub>
+            </m:oMath>
+            <w:r>
+              <w:rPr>
+                <w:rFonts w:ascii="Times New Roman" w:hAnsi="Times New Roman" w:eastAsia="Times New Roman" w:cs="Times New Roman"/>
+              </w:rPr>
+              <w:t xml:space="preserve">​</w:t>
+            </w:r>
+          </w:p>
+        </w:tc>
+        <w:tc>
+          <w:tcPr/>
+          <w:p>
+            <w:pPr>
+              <w:pStyle w:val="Compact"/>
+              <w:jc w:val="center"/>
+            </w:pPr>
+            <w:r>
+              <w:rPr>
+                <w:rFonts w:hint="eastAsia" w:ascii="Times New Roman" w:hAnsi="Times New Roman" w:eastAsia="FangSong" w:cs="Times New Roman"/>
+              </w:rPr>
+              <w:t xml:space="preserve">无色</w:t>
+            </w:r>
+          </w:p>
+        </w:tc>
+        <w:tc>
+          <w:tcPr/>
+          <w:p>
+            <w:pPr>
+              <w:pStyle w:val="Compact"/>
+              <w:jc w:val="center"/>
+            </w:pPr>
+            <w:r>
+              <w:rPr>
+                <w:rFonts w:hint="eastAsia" w:ascii="Times New Roman" w:hAnsi="Times New Roman" w:eastAsia="FangSong" w:cs="Times New Roman"/>
+              </w:rPr>
+              <w:t xml:space="preserve">大蒜味</w:t>
+            </w:r>
+          </w:p>
+        </w:tc>
+        <w:tc>
+          <w:tcPr/>
+          <w:p>
+            <w:pPr>
+              <w:pStyle w:val="Compact"/>
+              <w:jc w:val="center"/>
+            </w:pPr>
+            <w:r>
+              <w:rPr>
+                <w:rFonts w:hint="eastAsia" w:ascii="Times New Roman" w:hAnsi="Times New Roman" w:eastAsia="FangSong" w:cs="Times New Roman"/>
+              </w:rPr>
+              <w:t>剧毒</w:t>
+            </w:r>
+            <w:r>
+              <w:rPr>
+                <w:rFonts w:hint="eastAsia" w:ascii="Times New Roman" w:hAnsi="Times New Roman" w:eastAsia="Times New Roman" w:cs="Times New Roman"/>
+              </w:rPr>
+              <w:t>，</w:t>
+            </w:r>
+            <w:r>
+              <w:rPr>
+                <w:rFonts w:hint="eastAsia" w:ascii="Times New Roman" w:hAnsi="Times New Roman" w:eastAsia="FangSong" w:cs="Times New Roman"/>
+              </w:rPr>
+              <w:t>混有</w:t>
+            </w:r>
+            <w:r>
+              <w:rPr>
+                <w:rFonts w:ascii="Times New Roman" w:hAnsi="Times New Roman" w:eastAsia="Times New Roman" w:cs="Times New Roman"/>
+              </w:rPr>
+              <w:t xml:space="preserve"> </w:t>
+            </w:r>
+            <m:oMath>
+              <m:sSub>
+                <m:e>
+                  <m:r>
+                    <m:rPr>
+                      <m:sty m:val="p"/>
+                    </m:rPr>
+                    <m:t>P</m:t>
+                  </m:r>
+                </m:e>
+                <m:sub>
+                  <m:r>
+                    <m:rPr>
+                      <m:sty m:val="p"/>
+                    </m:rPr>
+                    <m:t>2</m:t>
+                  </m:r>
+                </m:sub>
+              </m:sSub>
+              <m:sSub>
+                <m:e>
+                  <m:r>
+                    <m:rPr>
+                      <m:sty m:val="p"/>
+                    </m:rPr>
+                    <m:t>H</m:t>
+                  </m:r>
+                </m:e>
+                <m:sub>
+                  <m:r>
+                    <m:rPr>
+                      <m:sty m:val="p"/>
+                    </m:rPr>
+                    <m:t>4</m:t>
+                  </m:r>
+                </m:sub>
+              </m:sSub>
+            </m:oMath>
+            <w:r>
+              <w:rPr>
+                <w:rFonts w:ascii="Times New Roman" w:hAnsi="Times New Roman" w:eastAsia="Times New Roman" w:cs="Times New Roman"/>
+              </w:rPr>
+              <w:t xml:space="preserve"> </w:t>
+            </w:r>
+            <w:r>
+              <w:rPr>
+                <w:rFonts w:hint="eastAsia" w:ascii="Times New Roman" w:hAnsi="Times New Roman" w:eastAsia="FangSong" w:cs="Times New Roman"/>
+              </w:rPr>
+              <w:t xml:space="preserve">时在空气中极易自燃</w:t>
+            </w:r>
+          </w:p>
+        </w:tc>
+      </w:tr>
+      <w:tr>
+        <w:tc>
+          <w:tcPr/>
+          <w:p>
+            <w:pPr>
+              <w:pStyle w:val="Compact"/>
+              <w:jc w:val="center"/>
+            </w:pPr>
+            <m:oMath>
+              <m:r>
+                <m:rPr>
+                  <m:sty m:val="p"/>
+                </m:rPr>
+                <m:t>(</m:t>
+              </m:r>
+              <m:r>
+                <m:rPr>
+                  <m:sty m:val="p"/>
+                </m:rPr>
+                <m:t>C</m:t>
+              </m:r>
+              <m:r>
+                <m:rPr>
+                  <m:sty m:val="p"/>
+                </m:rPr>
+                <m:t>N</m:t>
+              </m:r>
+              <m:sSub>
+                <m:e>
+                  <m:r>
+                    <m:rPr>
+                      <m:sty m:val="p"/>
+                    </m:rPr>
+                    <m:t>)</m:t>
+                  </m:r>
+                </m:e>
+                <m:sub>
+                  <m:r>
+                    <m:t>2</m:t>
+                  </m:r>
+                </m:sub>
+              </m:sSub>
+            </m:oMath>
+            <w:r>
+              <w:rPr>
+                <w:rFonts w:ascii="Times New Roman" w:hAnsi="Times New Roman" w:eastAsia="Times New Roman" w:cs="Times New Roman"/>
+              </w:rPr>
+              <w:t xml:space="preserve">​</w:t>
+            </w:r>
+          </w:p>
+        </w:tc>
+        <w:tc>
+          <w:tcPr/>
+          <w:p>
+            <w:pPr>
+              <w:pStyle w:val="Compact"/>
+              <w:jc w:val="center"/>
+            </w:pPr>
+            <w:r>
+              <w:rPr>
+                <w:rFonts w:hint="eastAsia" w:ascii="Times New Roman" w:hAnsi="Times New Roman" w:eastAsia="FangSong" w:cs="Times New Roman"/>
+              </w:rPr>
+              <w:t xml:space="preserve">无色</w:t>
+            </w:r>
+          </w:p>
+        </w:tc>
+        <w:tc>
+          <w:tcPr/>
+          <w:p>
+            <w:pPr>
+              <w:pStyle w:val="Compact"/>
+              <w:jc w:val="center"/>
+            </w:pPr>
+            <w:r>
+              <w:rPr>
+                <w:rFonts w:hint="eastAsia" w:ascii="Times New Roman" w:hAnsi="Times New Roman" w:eastAsia="FangSong" w:cs="Times New Roman"/>
+              </w:rPr>
+              <w:t xml:space="preserve">苦杏仁味</w:t>
+            </w:r>
+          </w:p>
+        </w:tc>
+        <w:tc>
+          <w:tcPr/>
+          <w:p>
+            <w:pPr>
+              <w:pStyle w:val="Compact"/>
+              <w:jc w:val="center"/>
+            </w:pPr>
+            <w:r>
+              <w:rPr>
+                <w:rFonts w:hint="eastAsia" w:ascii="Times New Roman" w:hAnsi="Times New Roman" w:eastAsia="FangSong" w:cs="Times New Roman"/>
+              </w:rPr>
+              <w:t>拟卤素</w:t>
+            </w:r>
+            <w:r>
+              <w:rPr>
+                <w:rFonts w:hint="eastAsia" w:ascii="Times New Roman" w:hAnsi="Times New Roman" w:eastAsia="Times New Roman" w:cs="Times New Roman"/>
+              </w:rPr>
+              <w:t>，</w:t>
+            </w:r>
+            <w:r>
+              <w:rPr>
+                <w:rFonts w:hint="eastAsia" w:ascii="Times New Roman" w:hAnsi="Times New Roman" w:eastAsia="FangSong" w:cs="Times New Roman"/>
+              </w:rPr>
+              <w:t>与碱歧化</w:t>
+            </w:r>
+            <w:r>
+              <w:rPr>
+                <w:rFonts w:hint="eastAsia" w:ascii="Times New Roman" w:hAnsi="Times New Roman" w:eastAsia="Times New Roman" w:cs="Times New Roman"/>
+              </w:rPr>
+              <w:t>，</w:t>
+            </w:r>
+            <w:r>
+              <w:rPr>
+                <w:rFonts w:hint="eastAsia" w:ascii="Times New Roman" w:hAnsi="Times New Roman" w:eastAsia="FangSong" w:cs="Times New Roman"/>
+              </w:rPr>
+              <w:t>剧毒</w:t>
+            </w:r>
+          </w:p>
+        </w:tc>
+      </w:tr>
+      <w:tr>
+        <w:tc>
+          <w:tcPr/>
+          <w:p>
+            <w:pPr>
+              <w:pStyle w:val="Compact"/>
+              <w:jc w:val="center"/>
+            </w:pPr>
+            <m:oMath>
+              <m:r>
+                <m:rPr>
+                  <m:sty m:val="p"/>
+                </m:rPr>
+                <m:t>C</m:t>
+              </m:r>
+              <m:r>
+                <m:rPr>
+                  <m:sty m:val="p"/>
+                </m:rPr>
+                <m:t>O</m:t>
+              </m:r>
+            </m:oMath>
+            <w:r>
+              <w:rPr>
+                <w:rFonts w:ascii="Times New Roman" w:hAnsi="Times New Roman" w:eastAsia="Times New Roman" w:cs="Times New Roman"/>
+              </w:rPr>
+              <w:t xml:space="preserve">​</w:t>
+            </w:r>
+          </w:p>
+        </w:tc>
+        <w:tc>
+          <w:tcPr/>
+          <w:p>
+            <w:pPr>
+              <w:pStyle w:val="Compact"/>
+              <w:jc w:val="center"/>
+            </w:pPr>
+            <w:r>
+              <w:rPr>
+                <w:rFonts w:hint="eastAsia" w:ascii="Times New Roman" w:hAnsi="Times New Roman" w:eastAsia="FangSong" w:cs="Times New Roman"/>
+              </w:rPr>
+              <w:t xml:space="preserve">无色</w:t>
+            </w:r>
+          </w:p>
+        </w:tc>
+        <w:tc>
+          <w:tcPr/>
+          <w:p>
+            <w:pPr>
+              <w:pStyle w:val="Compact"/>
+              <w:jc w:val="center"/>
+            </w:pPr>
+            <w:r>
+              <w:rPr>
+                <w:rFonts w:hint="eastAsia" w:ascii="Times New Roman" w:hAnsi="Times New Roman" w:eastAsia="FangSong" w:cs="Times New Roman"/>
+              </w:rPr>
+              <w:t xml:space="preserve">无味</w:t>
+            </w:r>
+          </w:p>
+        </w:tc>
+        <w:tc>
+          <w:tcPr/>
+          <w:p>
+            <w:pPr>
+              <w:pStyle w:val="Compact"/>
+              <w:jc w:val="center"/>
+            </w:pPr>
+            <w:r>
+              <w:rPr>
+                <w:rFonts w:hint="eastAsia" w:ascii="Times New Roman" w:hAnsi="Times New Roman" w:eastAsia="FangSong" w:cs="Times New Roman"/>
+              </w:rPr>
+              <w:t>剧毒</w:t>
+            </w:r>
+            <w:r>
+              <w:rPr>
+                <w:rFonts w:hint="eastAsia" w:ascii="Times New Roman" w:hAnsi="Times New Roman" w:eastAsia="Times New Roman" w:cs="Times New Roman"/>
+              </w:rPr>
+              <w:t>，</w:t>
+            </w:r>
+            <w:r>
+              <w:rPr>
+                <w:rFonts w:hint="eastAsia" w:ascii="Times New Roman" w:hAnsi="Times New Roman" w:eastAsia="FangSong" w:cs="Times New Roman"/>
+              </w:rPr>
+              <w:t>燃烧呈蓝色火焰</w:t>
+            </w:r>
+            <w:r>
+              <w:rPr>
+                <w:rFonts w:hint="eastAsia" w:ascii="Times New Roman" w:hAnsi="Times New Roman" w:eastAsia="Times New Roman" w:cs="Times New Roman"/>
+              </w:rPr>
+              <w:t>，</w:t>
+            </w:r>
+            <w:r>
+              <w:rPr>
+                <w:rFonts w:hint="eastAsia" w:ascii="Times New Roman" w:hAnsi="Times New Roman" w:eastAsia="FangSong" w:cs="Times New Roman"/>
+              </w:rPr>
+              <w:t>能还原金属氧化物</w:t>
+            </w:r>
+          </w:p>
+        </w:tc>
+      </w:tr>
+      <w:tr>
+        <w:tc>
+          <w:tcPr/>
+          <w:p>
+            <w:pPr>
+              <w:pStyle w:val="Compact"/>
+              <w:jc w:val="center"/>
+            </w:pPr>
+            <m:oMath>
+              <m:r>
+                <m:rPr>
+                  <m:sty m:val="p"/>
+                </m:rPr>
+                <m:t>C</m:t>
+              </m:r>
+              <m:sSub>
+                <m:e>
+                  <m:r>
+                    <m:rPr>
+                      <m:sty m:val="p"/>
+                    </m:rPr>
+                    <m:t>O</m:t>
+                  </m:r>
+                </m:e>
+                <m:sub>
+                  <m:r>
+                    <m:rPr>
+                      <m:sty m:val="p"/>
+                    </m:rPr>
+                    <m:t>2</m:t>
+                  </m:r>
+                </m:sub>
+              </m:sSub>
+            </m:oMath>
+            <w:r>
+              <w:rPr>
+                <w:rFonts w:ascii="Times New Roman" w:hAnsi="Times New Roman" w:eastAsia="Times New Roman" w:cs="Times New Roman"/>
+              </w:rPr>
+              <w:t xml:space="preserve">​</w:t>
+            </w:r>
+          </w:p>
+        </w:tc>
+        <w:tc>
+          <w:tcPr/>
+          <w:p>
+            <w:pPr>
+              <w:pStyle w:val="Compact"/>
+              <w:jc w:val="center"/>
+            </w:pPr>
+            <w:r>
+              <w:rPr>
+                <w:rFonts w:hint="eastAsia" w:ascii="Times New Roman" w:hAnsi="Times New Roman" w:eastAsia="FangSong" w:cs="Times New Roman"/>
+              </w:rPr>
+              <w:t xml:space="preserve">无色</w:t>
+            </w:r>
+          </w:p>
+        </w:tc>
+        <w:tc>
+          <w:tcPr/>
+          <w:p>
+            <w:pPr>
+              <w:pStyle w:val="Compact"/>
+              <w:jc w:val="center"/>
+            </w:pPr>
+            <w:r>
+              <w:rPr>
+                <w:rFonts w:hint="eastAsia" w:ascii="Times New Roman" w:hAnsi="Times New Roman" w:eastAsia="FangSong" w:cs="Times New Roman"/>
+              </w:rPr>
+              <w:t xml:space="preserve">无味</w:t>
+            </w:r>
+          </w:p>
+        </w:tc>
+        <w:tc>
+          <w:tcPr/>
+          <w:p>
+            <w:pPr>
+              <w:pStyle w:val="Compact"/>
+              <w:jc w:val="center"/>
+            </w:pPr>
+            <w:r>
+              <w:rPr>
+                <w:rFonts w:hint="eastAsia" w:ascii="Times New Roman" w:hAnsi="Times New Roman" w:eastAsia="FangSong" w:cs="Times New Roman"/>
+              </w:rPr>
+              <w:t xml:space="preserve">使澄清石灰水变浑浊</w:t>
+            </w:r>
+          </w:p>
+        </w:tc>
+      </w:tr>
+      <w:tr>
+        <w:tc>
+          <w:tcPr/>
+          <w:p>
+            <w:pPr>
+              <w:pStyle w:val="Compact"/>
+              <w:jc w:val="center"/>
+            </w:pPr>
+            <m:oMath>
+              <m:sSub>
+                <m:e>
+                  <m:r>
+                    <m:rPr>
+                      <m:sty m:val="p"/>
+                    </m:rPr>
+                    <m:t>O</m:t>
+                  </m:r>
+                </m:e>
+                <m:sub>
+                  <m:r>
+                    <m:rPr>
+                      <m:sty m:val="p"/>
+                    </m:rPr>
+                    <m:t>3</m:t>
+                  </m:r>
+                </m:sub>
+              </m:sSub>
+            </m:oMath>
+            <w:r>
+              <w:rPr>
+                <w:rFonts w:ascii="Times New Roman" w:hAnsi="Times New Roman" w:eastAsia="Times New Roman" w:cs="Times New Roman"/>
+              </w:rPr>
+              <w:t xml:space="preserve">​</w:t>
+            </w:r>
+          </w:p>
+        </w:tc>
+        <w:tc>
+          <w:tcPr/>
+          <w:p>
+            <w:pPr>
+              <w:pStyle w:val="Compact"/>
+              <w:jc w:val="center"/>
+            </w:pPr>
+            <w:r>
+              <w:rPr>
+                <w:rFonts w:hint="eastAsia" w:ascii="Times New Roman" w:hAnsi="Times New Roman" w:eastAsia="FangSong" w:cs="Times New Roman"/>
+              </w:rPr>
+              <w:t xml:space="preserve">淡蓝色</w:t>
+            </w:r>
+          </w:p>
+        </w:tc>
+        <w:tc>
+          <w:tcPr/>
+          <w:p>
+            <w:pPr>
+              <w:pStyle w:val="Compact"/>
+              <w:jc w:val="center"/>
+            </w:pPr>
+            <w:r>
+              <w:rPr>
+                <w:rFonts w:hint="eastAsia" w:ascii="Times New Roman" w:hAnsi="Times New Roman" w:eastAsia="FangSong" w:cs="Times New Roman"/>
+              </w:rPr>
+              <w:t xml:space="preserve">鱼腥味</w:t>
+            </w:r>
+          </w:p>
+        </w:tc>
+        <w:tc>
+          <w:tcPr/>
+          <w:p>
+            <w:pPr>
+              <w:pStyle w:val="Compact"/>
+              <w:jc w:val="center"/>
+            </w:pPr>
+            <w:r>
+              <w:rPr>
+                <w:rFonts w:hint="eastAsia" w:ascii="Times New Roman" w:hAnsi="Times New Roman" w:eastAsia="FangSong" w:cs="Times New Roman"/>
+              </w:rPr>
+              <w:t>强氧化性</w:t>
+            </w:r>
+            <w:r>
+              <w:rPr>
+                <w:rFonts w:hint="eastAsia" w:ascii="Times New Roman" w:hAnsi="Times New Roman" w:eastAsia="Times New Roman" w:cs="Times New Roman"/>
+              </w:rPr>
+              <w:t>，</w:t>
+            </w:r>
+            <w:r>
+              <w:rPr>
+                <w:rFonts w:hint="eastAsia" w:ascii="Times New Roman" w:hAnsi="Times New Roman" w:eastAsia="FangSong" w:cs="Times New Roman"/>
+              </w:rPr>
+              <w:t>使碘化钾淀粉溶液变蓝</w:t>
+            </w:r>
+          </w:p>
+        </w:tc>
+      </w:tr>
+      <w:tr>
+        <w:tc>
+          <w:tcPr/>
+          <w:p>
+            <w:pPr>
+              <w:pStyle w:val="Compact"/>
+              <w:jc w:val="center"/>
+            </w:pPr>
+            <m:oMath>
+              <m:sSub>
+                <m:e>
+                  <m:r>
+                    <m:rPr>
+                      <m:sty m:val="p"/>
+                    </m:rPr>
+                    <m:t>O</m:t>
+                  </m:r>
+                </m:e>
+                <m:sub>
+                  <m:r>
+                    <m:rPr>
+                      <m:sty m:val="p"/>
+                    </m:rPr>
+                    <m:t>2</m:t>
+                  </m:r>
+                </m:sub>
+              </m:sSub>
+            </m:oMath>
+            <w:r>
+              <w:rPr>
+                <w:rFonts w:ascii="Times New Roman" w:hAnsi="Times New Roman" w:eastAsia="Times New Roman" w:cs="Times New Roman"/>
+              </w:rPr>
+              <w:t xml:space="preserve">​</w:t>
+            </w:r>
+          </w:p>
+        </w:tc>
+        <w:tc>
+          <w:tcPr/>
+          <w:p>
+            <w:pPr>
+              <w:pStyle w:val="Compact"/>
+              <w:jc w:val="center"/>
+            </w:pPr>
+            <w:r>
+              <w:rPr>
+                <w:rFonts w:hint="eastAsia" w:ascii="Times New Roman" w:hAnsi="Times New Roman" w:eastAsia="FangSong" w:cs="Times New Roman"/>
+              </w:rPr>
+              <w:t xml:space="preserve">无色</w:t>
+            </w:r>
+          </w:p>
+        </w:tc>
+        <w:tc>
+          <w:tcPr/>
+          <w:p>
+            <w:pPr>
+              <w:pStyle w:val="Compact"/>
+              <w:jc w:val="center"/>
+            </w:pPr>
+            <w:r>
+              <w:rPr>
+                <w:rFonts w:hint="eastAsia" w:ascii="Times New Roman" w:hAnsi="Times New Roman" w:eastAsia="FangSong" w:cs="Times New Roman"/>
+              </w:rPr>
+              <w:t xml:space="preserve">无味</w:t>
+            </w:r>
+          </w:p>
+        </w:tc>
+        <w:tc>
+          <w:tcPr/>
+          <w:p>
+            <w:pPr>
+              <w:pStyle w:val="Compact"/>
+              <w:jc w:val="center"/>
+            </w:pPr>
+            <w:r>
+              <w:rPr>
+                <w:rFonts w:hint="eastAsia" w:ascii="Times New Roman" w:hAnsi="Times New Roman" w:eastAsia="FangSong" w:cs="Times New Roman"/>
+              </w:rPr>
+              <w:t xml:space="preserve">使带火星的木条复燃</w:t>
+            </w:r>
+          </w:p>
+        </w:tc>
+      </w:tr>
+      <w:tr>
+        <w:tc>
+          <w:tcPr/>
+          <w:p>
+            <w:pPr>
+              <w:pStyle w:val="Compact"/>
+              <w:jc w:val="center"/>
+            </w:pPr>
+            <m:oMath>
+              <m:sSub>
+                <m:e>
+                  <m:r>
+                    <m:rPr>
+                      <m:sty m:val="p"/>
+                    </m:rPr>
+                    <m:t>H</m:t>
+                  </m:r>
+                </m:e>
+                <m:sub>
+                  <m:r>
+                    <m:rPr>
+                      <m:sty m:val="p"/>
+                    </m:rPr>
+                    <m:t>2</m:t>
+                  </m:r>
+                </m:sub>
+              </m:sSub>
+            </m:oMath>
+            <w:r>
+              <w:rPr>
+                <w:rFonts w:ascii="Times New Roman" w:hAnsi="Times New Roman" w:eastAsia="Times New Roman" w:cs="Times New Roman"/>
+              </w:rPr>
+              <w:t xml:space="preserve">​</w:t>
+            </w:r>
+          </w:p>
+        </w:tc>
+        <w:tc>
+          <w:tcPr/>
+          <w:p>
+            <w:pPr>
+              <w:pStyle w:val="Compact"/>
+              <w:jc w:val="center"/>
+            </w:pPr>
+            <w:r>
+              <w:rPr>
+                <w:rFonts w:hint="eastAsia" w:ascii="Times New Roman" w:hAnsi="Times New Roman" w:eastAsia="FangSong" w:cs="Times New Roman"/>
+              </w:rPr>
+              <w:t xml:space="preserve">无色</w:t>
+            </w:r>
+          </w:p>
+        </w:tc>
+        <w:tc>
+          <w:tcPr/>
+          <w:p>
+            <w:pPr>
+              <w:pStyle w:val="Compact"/>
+              <w:jc w:val="center"/>
+            </w:pPr>
+            <w:r>
+              <w:rPr>
+                <w:rFonts w:hint="eastAsia" w:ascii="Times New Roman" w:hAnsi="Times New Roman" w:eastAsia="FangSong" w:cs="Times New Roman"/>
+              </w:rPr>
+              <w:t xml:space="preserve">无味</w:t>
+            </w:r>
+          </w:p>
+        </w:tc>
+        <w:tc>
+          <w:tcPr/>
+          <w:p>
+            <w:pPr>
+              <w:pStyle w:val="Compact"/>
+              <w:jc w:val="center"/>
+            </w:pPr>
+            <w:r>
+              <w:rPr>
+                <w:rFonts w:hint="eastAsia" w:ascii="Times New Roman" w:hAnsi="Times New Roman" w:eastAsia="FangSong" w:cs="Times New Roman"/>
+              </w:rPr>
+              <w:t>燃烧呈淡蓝色火焰</w:t>
+            </w:r>
+            <w:r>
+              <w:rPr>
+                <w:rFonts w:hint="eastAsia" w:ascii="Times New Roman" w:hAnsi="Times New Roman" w:eastAsia="Times New Roman" w:cs="Times New Roman"/>
+              </w:rPr>
+              <w:t>，</w:t>
+            </w:r>
+            <w:r>
+              <w:rPr>
+                <w:rFonts w:hint="eastAsia" w:ascii="Times New Roman" w:hAnsi="Times New Roman" w:eastAsia="FangSong" w:cs="Times New Roman"/>
+              </w:rPr>
+              <w:t>点燃爆鸣</w:t>
+            </w:r>
+          </w:p>
+        </w:tc>
+      </w:tr>
+    </w:tbl>
     <w:p>
       <w:pPr>
         <w:spacing w:before="160" w:after="80"/>
@@ -10511,9 +12621,9 @@
         </w:pict>
       </w:r>
     </w:p>
-    <w:bookmarkEnd w:id="26"/>
-    <w:bookmarkEnd w:id="27"/>
-    <w:bookmarkStart w:id="34" w:name="价态变化法与配合物生成法"/>
+    <w:bookmarkEnd w:id="23"/>
+    <w:bookmarkEnd w:id="24"/>
+    <w:bookmarkStart w:id="31" w:name="价态变化法与配合物生成法"/>
     <w:p>
       <w:pPr>
         <w:pStyle w:val="Heading2"/>
@@ -10686,7 +12796,7 @@
         <w:t>。</w:t>
       </w:r>
     </w:p>
-    <w:bookmarkStart w:id="28" w:name="价态变化信号价态数轴-歧化"/>
+    <w:bookmarkStart w:id="25" w:name="价态变化信号价态数轴-歧化"/>
     <w:p>
       <w:pPr>
         <w:pStyle w:val="Heading3"/>
@@ -12352,8 +14462,8 @@
         <w:t xml:space="preserve">6）</w:t>
       </w:r>
     </w:p>
-    <w:bookmarkEnd w:id="28"/>
-    <w:bookmarkStart w:id="29" w:name="配合物生成信号配体诱导颜色突变"/>
+    <w:bookmarkEnd w:id="25"/>
+    <w:bookmarkStart w:id="26" w:name="配合物生成信号配体诱导颜色突变"/>
     <w:p>
       <w:pPr>
         <w:pStyle w:val="Heading3"/>
@@ -13482,8 +15592,8 @@
         <w:t xml:space="preserve">7）</w:t>
       </w:r>
     </w:p>
-    <w:bookmarkEnd w:id="29"/>
-    <w:bookmarkStart w:id="33" w:name="介质和条件决定产物"/>
+    <w:bookmarkEnd w:id="26"/>
+    <w:bookmarkStart w:id="30" w:name="介质和条件决定产物"/>
     <w:p>
       <w:pPr>
         <w:pStyle w:val="Heading3"/>
@@ -14065,146 +16175,219 @@
     </w:tbl>
     <w:p>
       <w:pPr>
-        <w:pStyle w:val="BodyText"/>
-        <w:spacing w:before="160" w:after="80"/>
+        <w:spacing w:before="120" w:after="80"/>
+      </w:pPr>
+    </w:p>
+    <w:tbl>
+      <w:tblPr>
+        <w:tblStyle w:val="Table"/>
+        <w:tblW w:type="pct" w:w="5000"/>
+        <w:tblLayout w:type="fixed"/>
+        <w:tblLook w:firstRow="1" w:lastRow="0" w:firstColumn="0" w:lastColumn="0" w:noHBand="0" w:noVBand="0" w:val="0020"/>
         <w:jc w:val="center"/>
-      </w:pPr>
-      <w:r>
-        <w:rPr>
-          <w:rFonts w:ascii="Times New Roman" w:hAnsi="Times New Roman" w:eastAsia="Times New Roman" w:cs="Times New Roman"/>
-        </w:rPr>
-        <w:drawing>
-          <wp:inline>
-            <wp:extent cx="2667000" cy="680367"/>
-            <wp:effectExtent b="0" l="0" r="0" t="0"/>
-            <wp:docPr descr="" title="" id="31" name="Picture"/>
-            <a:graphic>
-              <a:graphicData uri="http://schemas.openxmlformats.org/drawingml/2006/picture">
-                <pic:pic>
-                  <pic:nvPicPr>
-                    <pic:cNvPr descr="4a925939012766aa8af87011ce54628273d8fa55a687da41ec12611d656b5155.png" id="32" name="Picture"/>
-                    <pic:cNvPicPr>
-                      <a:picLocks noChangeArrowheads="1" noChangeAspect="1"/>
-                    </pic:cNvPicPr>
-                  </pic:nvPicPr>
-                  <pic:blipFill>
-                    <a:blip r:embed="rId30"/>
-                    <a:stretch>
-                      <a:fillRect/>
-                    </a:stretch>
-                  </pic:blipFill>
-                  <pic:spPr bwMode="auto">
-                    <a:xfrm>
-                      <a:off x="0" y="0"/>
-                      <a:ext cx="2667000" cy="680367"/>
-                    </a:xfrm>
-                    <a:prstGeom prst="rect">
-                      <a:avLst/>
-                    </a:prstGeom>
-                    <a:noFill/>
-                    <a:ln w="9525">
-                      <a:noFill/>
-                      <a:headEnd/>
-                      <a:tailEnd/>
-                    </a:ln>
-                  </pic:spPr>
-                </pic:pic>
-              </a:graphicData>
-            </a:graphic>
-          </wp:inline>
-        </w:drawing>
-      </w:r>
-      <w:r>
-        <w:rPr>
-          <w:rFonts w:ascii="Times New Roman" w:hAnsi="Times New Roman" w:eastAsia="Times New Roman" w:cs="Times New Roman"/>
-        </w:rPr>
-        <w:t xml:space="preserve"> </w:t>
-      </w:r>
-      <w:r>
-        <w:rPr>
-          <w:rFonts w:ascii="Times New Roman" w:hAnsi="Times New Roman" w:eastAsia="Times New Roman" w:cs="Times New Roman"/>
-        </w:rPr>
-        <w:t xml:space="preserve">&gt; </w:t>
-      </w:r>
-      <w:r>
-        <w:rPr>
-          <w:rFonts w:hint="eastAsia" w:ascii="Times New Roman" w:hAnsi="Times New Roman" w:eastAsia="FangSong" w:cs="Times New Roman"/>
-        </w:rPr>
-        <w:t xml:space="preserve">图</w:t>
-      </w:r>
-      <w:r>
-        <w:rPr>
-          <w:rFonts w:ascii="Times New Roman" w:hAnsi="Times New Roman" w:eastAsia="Times New Roman" w:cs="Times New Roman"/>
-        </w:rPr>
-        <w:t xml:space="preserve"> </w:t>
-      </w:r>
-      <w:r>
-        <w:rPr>
-          <w:rFonts w:hint="eastAsia" w:ascii="Times New Roman" w:hAnsi="Times New Roman" w:eastAsia="Times New Roman" w:cs="Times New Roman"/>
-        </w:rPr>
-        <w:t>8-4：</w:t>
-      </w:r>
-      <w:r>
-        <w:rPr>
-          <w:rFonts w:hint="eastAsia" w:ascii="Times New Roman" w:hAnsi="Times New Roman" w:eastAsia="FangSong" w:cs="Times New Roman"/>
-        </w:rPr>
-        <w:t>锰元素酸性介质</w:t>
-      </w:r>
-      <w:r>
-        <w:rPr>
-          <w:rFonts w:ascii="Times New Roman" w:hAnsi="Times New Roman" w:eastAsia="Times New Roman" w:cs="Times New Roman"/>
-        </w:rPr>
-        <w:t xml:space="preserve"> Latimer </w:t>
-      </w:r>
-      <w:r>
-        <w:rPr>
-          <w:rFonts w:hint="eastAsia" w:ascii="Times New Roman" w:hAnsi="Times New Roman" w:eastAsia="FangSong" w:cs="Times New Roman"/>
-        </w:rPr>
-        <w:t>电势图</w:t>
-      </w:r>
-      <w:r>
-        <w:rPr>
-          <w:rFonts w:hint="eastAsia" w:ascii="Times New Roman" w:hAnsi="Times New Roman" w:eastAsia="Times New Roman" w:cs="Times New Roman"/>
-        </w:rPr>
-        <w:t>（</w:t>
-      </w:r>
-      <w:r>
-        <w:rPr>
-          <w:rFonts w:hint="eastAsia" w:ascii="Times New Roman" w:hAnsi="Times New Roman" w:eastAsia="FangSong" w:cs="Times New Roman"/>
-        </w:rPr>
-        <w:t>歧化判据</w:t>
-      </w:r>
-      <w:r>
-        <w:rPr>
-          <w:rFonts w:hint="eastAsia" w:ascii="Times New Roman" w:hAnsi="Times New Roman" w:eastAsia="Times New Roman" w:cs="Times New Roman"/>
-        </w:rPr>
-        <w:t>：</w:t>
-      </w:r>
-      <w:r>
-        <w:rPr>
-          <w:rFonts w:hint="eastAsia" w:ascii="Times New Roman" w:hAnsi="Times New Roman" w:eastAsia="FangSong" w:cs="Times New Roman"/>
-        </w:rPr>
-        <w:t>右侧电势</w:t>
-      </w:r>
-      <w:r>
-        <w:rPr>
-          <w:rFonts w:ascii="Times New Roman" w:hAnsi="Times New Roman" w:eastAsia="Times New Roman" w:cs="Times New Roman"/>
-        </w:rPr>
-        <w:t xml:space="preserve"> &gt; </w:t>
-      </w:r>
-      <w:r>
-        <w:rPr>
-          <w:rFonts w:hint="eastAsia" w:ascii="Times New Roman" w:hAnsi="Times New Roman" w:eastAsia="FangSong" w:cs="Times New Roman"/>
-        </w:rPr>
-        <w:t>左侧电势</w:t>
-      </w:r>
-      <w:r>
-        <w:rPr>
-          <w:rFonts w:hint="eastAsia" w:ascii="Times New Roman" w:hAnsi="Times New Roman" w:eastAsia="Times New Roman" w:cs="Times New Roman"/>
-        </w:rPr>
-        <w:t>）</w:t>
-      </w:r>
-    </w:p>
+        <w:tblBorders>
+          <w:top w:val="single" w:sz="12" w:space="0" w:color="333333"/>
+          <w:bottom w:val="single" w:sz="12" w:space="0" w:color="333333"/>
+          <w:left w:val="none"/>
+          <w:right w:val="none"/>
+          <w:insideH w:val="none"/>
+          <w:insideV w:val="none"/>
+        </w:tblBorders>
+      </w:tblPr>
+      <w:tblGrid>
+        <w:gridCol w:w="7920"/>
+      </w:tblGrid>
+      <w:tr>
+        <w:trPr>
+          <w:tblHeader w:val="on"/>
+        </w:trPr>
+        <w:tc>
+          <w:tcPr>
+            <w:tcBorders>
+              <w:bottom w:val="single" w:sz="6" w:space="0" w:color="333333"/>
+            </w:tcBorders>
+          </w:tcPr>
+          <w:p>
+            <w:pPr>
+              <w:pStyle w:val="Compact"/>
+              <w:jc w:val="center"/>
+            </w:pPr>
+            <w:r>
+              <w:rPr>
+                <w:rFonts w:hint="eastAsia" w:ascii="Times New Roman" w:hAnsi="Times New Roman" w:eastAsia="SimHei" w:cs="Times New Roman"/>
+                <w:b/>
+              </w:rPr>
+              <w:t xml:space="preserve">锰元素酸性介质</w:t>
+            </w:r>
+            <w:r>
+              <w:rPr>
+                <w:rFonts w:ascii="Times New Roman" w:hAnsi="Times New Roman" w:eastAsia="Times New Roman" w:cs="Times New Roman"/>
+                <w:b/>
+              </w:rPr>
+              <w:t xml:space="preserve"> Latimer </w:t>
+            </w:r>
+            <w:r>
+              <w:rPr>
+                <w:rFonts w:hint="eastAsia" w:ascii="Times New Roman" w:hAnsi="Times New Roman" w:eastAsia="SimHei" w:cs="Times New Roman"/>
+                <w:b/>
+              </w:rPr>
+              <w:t xml:space="preserve">电势</w:t>
+            </w:r>
+          </w:p>
+        </w:tc>
+      </w:tr>
+      <w:tr>
+        <w:tc>
+          <w:tcPr/>
+          <w:p>
+            <w:pPr>
+              <w:pStyle w:val="Compact"/>
+              <w:jc w:val="center"/>
+            </w:pPr>
+            <w:r>
+              <w:rPr>
+                <w:rFonts w:ascii="Times New Roman" w:hAnsi="Times New Roman" w:eastAsia="Times New Roman" w:cs="Times New Roman"/>
+              </w:rPr>
+              <w:drawing>
+                <wp:inline>
+                  <wp:extent cx="2667000" cy="680367"/>
+                  <wp:effectExtent b="0" l="0" r="0" t="0"/>
+                  <wp:docPr descr="" title="" id="28" name="Picture"/>
+                  <a:graphic>
+                    <a:graphicData uri="http://schemas.openxmlformats.org/drawingml/2006/picture">
+                      <pic:pic>
+                        <pic:nvPicPr>
+                          <pic:cNvPr descr="4a925939012766aa8af87011ce54628273d8fa55a687da41ec12611d656b5155.png" id="29" name="Picture"/>
+                          <pic:cNvPicPr>
+                            <a:picLocks noChangeArrowheads="1" noChangeAspect="1"/>
+                          </pic:cNvPicPr>
+                        </pic:nvPicPr>
+                        <pic:blipFill>
+                          <a:blip r:embed="rId27"/>
+                          <a:stretch>
+                            <a:fillRect/>
+                          </a:stretch>
+                        </pic:blipFill>
+                        <pic:spPr bwMode="auto">
+                          <a:xfrm>
+                            <a:off x="0" y="0"/>
+                            <a:ext cx="2667000" cy="680367"/>
+                          </a:xfrm>
+                          <a:prstGeom prst="rect">
+                            <a:avLst/>
+                          </a:prstGeom>
+                          <a:noFill/>
+                          <a:ln w="9525">
+                            <a:noFill/>
+                            <a:headEnd/>
+                            <a:tailEnd/>
+                          </a:ln>
+                        </pic:spPr>
+                      </pic:pic>
+                    </a:graphicData>
+                  </a:graphic>
+                </wp:inline>
+              </w:drawing>
+            </w:r>
+          </w:p>
+        </w:tc>
+      </w:tr>
+      <w:tr>
+        <w:tc>
+          <w:tcPr/>
+          <w:p>
+            <w:pPr>
+              <w:pStyle w:val="Compact"/>
+              <w:jc w:val="center"/>
+            </w:pPr>
+            <w:r>
+              <w:rPr>
+                <w:rFonts w:ascii="Times New Roman" w:hAnsi="Times New Roman" w:eastAsia="Times New Roman" w:cs="Times New Roman"/>
+              </w:rPr>
+              <w:t xml:space="preserve">&gt; </w:t>
+            </w:r>
+            <w:r>
+              <w:rPr>
+                <w:rFonts w:hint="eastAsia" w:ascii="Times New Roman" w:hAnsi="Times New Roman" w:eastAsia="FangSong" w:cs="Times New Roman"/>
+              </w:rPr>
+              <w:t xml:space="preserve">图</w:t>
+            </w:r>
+            <w:r>
+              <w:rPr>
+                <w:rFonts w:ascii="Times New Roman" w:hAnsi="Times New Roman" w:eastAsia="Times New Roman" w:cs="Times New Roman"/>
+              </w:rPr>
+              <w:t xml:space="preserve"> </w:t>
+            </w:r>
+            <w:r>
+              <w:rPr>
+                <w:rFonts w:hint="eastAsia" w:ascii="Times New Roman" w:hAnsi="Times New Roman" w:eastAsia="Times New Roman" w:cs="Times New Roman"/>
+              </w:rPr>
+              <w:t>8-3：</w:t>
+            </w:r>
+            <w:r>
+              <w:rPr>
+                <w:rFonts w:hint="eastAsia" w:ascii="Times New Roman" w:hAnsi="Times New Roman" w:eastAsia="FangSong" w:cs="Times New Roman"/>
+              </w:rPr>
+              <w:t>锰元素酸性介质</w:t>
+            </w:r>
+            <w:r>
+              <w:rPr>
+                <w:rFonts w:ascii="Times New Roman" w:hAnsi="Times New Roman" w:eastAsia="Times New Roman" w:cs="Times New Roman"/>
+              </w:rPr>
+              <w:t xml:space="preserve"> Latimer </w:t>
+            </w:r>
+            <w:r>
+              <w:rPr>
+                <w:rFonts w:hint="eastAsia" w:ascii="Times New Roman" w:hAnsi="Times New Roman" w:eastAsia="FangSong" w:cs="Times New Roman"/>
+              </w:rPr>
+              <w:t>电势图</w:t>
+            </w:r>
+            <w:r>
+              <w:rPr>
+                <w:rFonts w:hint="eastAsia" w:ascii="Times New Roman" w:hAnsi="Times New Roman" w:eastAsia="Times New Roman" w:cs="Times New Roman"/>
+              </w:rPr>
+              <w:t>（</w:t>
+            </w:r>
+            <w:r>
+              <w:rPr>
+                <w:rFonts w:hint="eastAsia" w:ascii="Times New Roman" w:hAnsi="Times New Roman" w:eastAsia="FangSong" w:cs="Times New Roman"/>
+              </w:rPr>
+              <w:t>歧化判据</w:t>
+            </w:r>
+            <w:r>
+              <w:rPr>
+                <w:rFonts w:hint="eastAsia" w:ascii="Times New Roman" w:hAnsi="Times New Roman" w:eastAsia="Times New Roman" w:cs="Times New Roman"/>
+              </w:rPr>
+              <w:t>：</w:t>
+            </w:r>
+            <w:r>
+              <w:rPr>
+                <w:rFonts w:hint="eastAsia" w:ascii="Times New Roman" w:hAnsi="Times New Roman" w:eastAsia="FangSong" w:cs="Times New Roman"/>
+              </w:rPr>
+              <w:t>右侧电势</w:t>
+            </w:r>
+            <w:r>
+              <w:rPr>
+                <w:rFonts w:ascii="Times New Roman" w:hAnsi="Times New Roman" w:eastAsia="Times New Roman" w:cs="Times New Roman"/>
+              </w:rPr>
+              <w:t xml:space="preserve"> &gt; </w:t>
+            </w:r>
+            <w:r>
+              <w:rPr>
+                <w:rFonts w:hint="eastAsia" w:ascii="Times New Roman" w:hAnsi="Times New Roman" w:eastAsia="FangSong" w:cs="Times New Roman"/>
+              </w:rPr>
+              <w:t>左侧电势</w:t>
+            </w:r>
+            <w:r>
+              <w:rPr>
+                <w:rFonts w:hint="eastAsia" w:ascii="Times New Roman" w:hAnsi="Times New Roman" w:eastAsia="Times New Roman" w:cs="Times New Roman"/>
+              </w:rPr>
+              <w:t>）</w:t>
+            </w:r>
+          </w:p>
+        </w:tc>
+      </w:tr>
+    </w:tbl>
     <w:p>
       <w:pPr>
         <w:spacing w:before="160" w:after="80"/>
@@ -14215,9 +16398,9 @@
         </w:pict>
       </w:r>
     </w:p>
-    <w:bookmarkEnd w:id="33"/>
-    <w:bookmarkEnd w:id="34"/>
-    <w:bookmarkStart w:id="42" w:name="否定信息利用与交叉验证"/>
+    <w:bookmarkEnd w:id="30"/>
+    <w:bookmarkEnd w:id="31"/>
+    <w:bookmarkStart w:id="39" w:name="否定信息利用与交叉验证"/>
     <w:p>
       <w:pPr>
         <w:pStyle w:val="Heading2"/>
@@ -14390,7 +16573,7 @@
         <w:t>。</w:t>
       </w:r>
     </w:p>
-    <w:bookmarkStart w:id="35" w:name="不字标记法"/>
+    <w:bookmarkStart w:id="32" w:name="不字标记法"/>
     <w:p>
       <w:pPr>
         <w:pStyle w:val="Heading3"/>
@@ -14639,8 +16822,8 @@
         <w:t>。」</w:t>
       </w:r>
     </w:p>
-    <w:bookmarkEnd w:id="35"/>
-    <w:bookmarkStart w:id="36" w:name="四大否定信号排除表"/>
+    <w:bookmarkEnd w:id="32"/>
+    <w:bookmarkStart w:id="33" w:name="四大否定信号排除表"/>
     <w:p>
       <w:pPr>
         <w:pStyle w:val="Heading3"/>
@@ -15720,8 +17903,8 @@
         </w:tc>
       </w:tr>
     </w:tbl>
-    <w:bookmarkEnd w:id="36"/>
-    <w:bookmarkStart w:id="37" w:name="无色不等于无过渡金属"/>
+    <w:bookmarkEnd w:id="33"/>
+    <w:bookmarkStart w:id="34" w:name="无色不等于无过渡金属"/>
     <w:p>
       <w:pPr>
         <w:pStyle w:val="Heading3"/>
@@ -16232,8 +18415,8 @@
         <w:t>。</w:t>
       </w:r>
     </w:p>
-    <w:bookmarkEnd w:id="37"/>
-    <w:bookmarkStart w:id="41" w:name="交叉验证决策路径"/>
+    <w:bookmarkEnd w:id="34"/>
+    <w:bookmarkStart w:id="38" w:name="交叉验证决策路径"/>
     <w:p>
       <w:pPr>
         <w:pStyle w:val="Heading3"/>
@@ -16847,6 +19030,7 @@
     <w:p>
       <w:pPr>
         <w:pStyle w:val="BodyText"/>
+        <w:spacing w:after="80"/>
         <w:ind w:firstLine="420"/>
       </w:pPr>
       <w:r>
@@ -17376,174 +19560,272 @@
         <w:t>迅速对候选池打叉</w:t>
       </w:r>
     </w:p>
-    <w:p>
-      <w:pPr>
-        <w:pStyle w:val="BodyText"/>
-        <w:spacing w:before="160" w:after="80"/>
+    <w:tbl>
+      <w:tblPr>
+        <w:tblStyle w:val="Table"/>
+        <w:tblW w:type="pct" w:w="5000"/>
+        <w:tblLayout w:type="fixed"/>
+        <w:tblLook w:firstRow="1" w:lastRow="0" w:firstColumn="0" w:lastColumn="0" w:noHBand="0" w:noVBand="0" w:val="0020"/>
         <w:jc w:val="center"/>
-      </w:pPr>
-      <w:r>
-        <w:rPr>
-          <w:rFonts w:ascii="Times New Roman" w:hAnsi="Times New Roman" w:eastAsia="Times New Roman" w:cs="Times New Roman"/>
-        </w:rPr>
-        <w:drawing>
-          <wp:inline>
-            <wp:extent cx="2667000" cy="1298938"/>
-            <wp:effectExtent b="0" l="0" r="0" t="0"/>
-            <wp:docPr descr="" title="" id="39" name="Picture"/>
-            <a:graphic>
-              <a:graphicData uri="http://schemas.openxmlformats.org/drawingml/2006/picture">
-                <pic:pic>
-                  <pic:nvPicPr>
-                    <pic:cNvPr descr="d7b33da4c59650effe5b5107280eca5cb04e077417f83697d268ef8bc480fac4.png" id="40" name="Picture"/>
-                    <pic:cNvPicPr>
-                      <a:picLocks noChangeArrowheads="1" noChangeAspect="1"/>
-                    </pic:cNvPicPr>
-                  </pic:nvPicPr>
-                  <pic:blipFill>
-                    <a:blip r:embed="rId38"/>
-                    <a:stretch>
-                      <a:fillRect/>
-                    </a:stretch>
-                  </pic:blipFill>
-                  <pic:spPr bwMode="auto">
-                    <a:xfrm>
-                      <a:off x="0" y="0"/>
-                      <a:ext cx="2667000" cy="1298938"/>
-                    </a:xfrm>
-                    <a:prstGeom prst="rect">
-                      <a:avLst/>
-                    </a:prstGeom>
-                    <a:noFill/>
-                    <a:ln w="9525">
-                      <a:noFill/>
-                      <a:headEnd/>
-                      <a:tailEnd/>
-                    </a:ln>
-                  </pic:spPr>
-                </pic:pic>
-              </a:graphicData>
-            </a:graphic>
-          </wp:inline>
-        </w:drawing>
-      </w:r>
-      <w:r>
-        <w:rPr>
-          <w:rFonts w:ascii="Times New Roman" w:hAnsi="Times New Roman" w:eastAsia="Times New Roman" w:cs="Times New Roman"/>
-        </w:rPr>
-        <w:t xml:space="preserve"> </w:t>
-      </w:r>
-      <w:r>
-        <w:rPr>
-          <w:rFonts w:ascii="Times New Roman" w:hAnsi="Times New Roman" w:eastAsia="Times New Roman" w:cs="Times New Roman"/>
-        </w:rPr>
-        <w:t xml:space="preserve">&gt; </w:t>
-      </w:r>
-      <w:r>
-        <w:rPr>
-          <w:rFonts w:hint="eastAsia" w:ascii="Times New Roman" w:hAnsi="Times New Roman" w:eastAsia="FangSong" w:cs="Times New Roman"/>
-        </w:rPr>
-        <w:t xml:space="preserve">图</w:t>
-      </w:r>
-      <w:r>
-        <w:rPr>
-          <w:rFonts w:ascii="Times New Roman" w:hAnsi="Times New Roman" w:eastAsia="Times New Roman" w:cs="Times New Roman"/>
-        </w:rPr>
-        <w:t xml:space="preserve"> </w:t>
-      </w:r>
-      <w:r>
-        <w:rPr>
-          <w:rFonts w:hint="eastAsia" w:ascii="Times New Roman" w:hAnsi="Times New Roman" w:eastAsia="Times New Roman" w:cs="Times New Roman"/>
-        </w:rPr>
-        <w:t>8-5：</w:t>
-      </w:r>
-      <w:r>
-        <w:rPr>
-          <w:rFonts w:hint="eastAsia" w:ascii="Times New Roman" w:hAnsi="Times New Roman" w:eastAsia="FangSong" w:cs="Times New Roman"/>
-        </w:rPr>
-        <w:t>元素推断色彩陷阱</w:t>
-      </w:r>
-      <w:r>
-        <w:rPr>
-          <w:rFonts w:hint="eastAsia" w:ascii="Times New Roman" w:hAnsi="Times New Roman" w:eastAsia="Times New Roman" w:cs="Times New Roman"/>
-        </w:rPr>
-        <w:t>：d</w:t>
-      </w:r>
-      <w:r>
-        <w:rPr>
-          <w:rFonts w:hint="eastAsia" w:ascii="Times New Roman" w:hAnsi="Times New Roman" w:eastAsia="Times New Roman" w:cs="Times New Roman"/>
-          <w:vertAlign w:val="superscript"/>
-        </w:rPr>
-        <w:t>0</w:t>
-      </w:r>
-      <w:r>
-        <w:rPr>
-          <w:rFonts w:hint="eastAsia" w:ascii="Times New Roman" w:hAnsi="Times New Roman" w:eastAsia="Times New Roman" w:cs="Times New Roman"/>
-        </w:rPr>
-        <w:t>/d</w:t>
-      </w:r>
-      <w:r>
-        <w:rPr>
-          <w:rFonts w:hint="eastAsia" w:ascii="Times New Roman" w:hAnsi="Times New Roman" w:eastAsia="Times New Roman" w:cs="Times New Roman"/>
-          <w:vertAlign w:val="superscript"/>
-        </w:rPr>
-        <w:t>10</w:t>
-      </w:r>
-      <w:r>
-        <w:rPr>
-          <w:rFonts w:ascii="Times New Roman" w:hAnsi="Times New Roman" w:eastAsia="Times New Roman" w:cs="Times New Roman"/>
-        </w:rPr>
-        <w:t xml:space="preserve"> </w:t>
-      </w:r>
-      <w:r>
-        <w:rPr>
-          <w:rFonts w:hint="eastAsia" w:ascii="Times New Roman" w:hAnsi="Times New Roman" w:eastAsia="FangSong" w:cs="Times New Roman"/>
-        </w:rPr>
-        <w:t>离子不一定无色</w:t>
-      </w:r>
-      <w:r>
-        <w:rPr>
-          <w:rFonts w:hint="eastAsia" w:ascii="Times New Roman" w:hAnsi="Times New Roman" w:eastAsia="Times New Roman" w:cs="Times New Roman"/>
-        </w:rPr>
-        <w:t>（</w:t>
-      </w:r>
-      <w:r>
-        <w:rPr>
-          <w:rFonts w:hint="eastAsia" w:ascii="Times New Roman" w:hAnsi="Times New Roman" w:eastAsia="FangSong" w:cs="Times New Roman"/>
-        </w:rPr>
-        <w:t>警惕</w:t>
-      </w:r>
-      <w:r>
-        <w:rPr>
-          <w:rFonts w:ascii="Times New Roman" w:hAnsi="Times New Roman" w:eastAsia="Times New Roman" w:cs="Times New Roman"/>
-        </w:rPr>
-        <w:t xml:space="preserve"> LMCT </w:t>
-      </w:r>
-      <w:r>
-        <w:rPr>
-          <w:rFonts w:hint="eastAsia" w:ascii="Times New Roman" w:hAnsi="Times New Roman" w:eastAsia="FangSong" w:cs="Times New Roman"/>
-        </w:rPr>
-        <w:t>配体</w:t>
-      </w:r>
-      <w:r>
-        <w:rPr>
-          <w:rFonts w:hint="eastAsia" w:ascii="Times New Roman" w:hAnsi="Times New Roman" w:eastAsia="Times New Roman" w:cs="Times New Roman"/>
-        </w:rPr>
-        <w:t>-</w:t>
-      </w:r>
-      <w:r>
-        <w:rPr>
-          <w:rFonts w:hint="eastAsia" w:ascii="Times New Roman" w:hAnsi="Times New Roman" w:eastAsia="FangSong" w:cs="Times New Roman"/>
-        </w:rPr>
-        <w:t>金属电荷转移跃迁</w:t>
-      </w:r>
-      <w:r>
-        <w:rPr>
-          <w:rFonts w:hint="eastAsia" w:ascii="Times New Roman" w:hAnsi="Times New Roman" w:eastAsia="Times New Roman" w:cs="Times New Roman"/>
-        </w:rPr>
-        <w:t>）</w:t>
-      </w:r>
-    </w:p>
+        <w:tblBorders>
+          <w:top w:val="single" w:sz="12" w:space="0" w:color="333333"/>
+          <w:bottom w:val="single" w:sz="12" w:space="0" w:color="333333"/>
+          <w:left w:val="none"/>
+          <w:right w:val="none"/>
+          <w:insideH w:val="none"/>
+          <w:insideV w:val="none"/>
+        </w:tblBorders>
+      </w:tblPr>
+      <w:tblGrid>
+        <w:gridCol w:w="7920"/>
+      </w:tblGrid>
+      <w:tr>
+        <w:trPr>
+          <w:tblHeader w:val="on"/>
+        </w:trPr>
+        <w:tc>
+          <w:tcPr>
+            <w:tcBorders>
+              <w:bottom w:val="single" w:sz="6" w:space="0" w:color="333333"/>
+            </w:tcBorders>
+          </w:tcPr>
+          <w:p>
+            <w:pPr>
+              <w:pStyle w:val="Compact"/>
+              <w:jc w:val="center"/>
+            </w:pPr>
+            <w:r>
+              <w:rPr>
+                <w:rFonts w:hint="eastAsia" w:ascii="Times New Roman" w:hAnsi="Times New Roman" w:eastAsia="SimHei" w:cs="Times New Roman"/>
+                <w:b/>
+              </w:rPr>
+              <w:t>元素推断色彩陷阱</w:t>
+            </w:r>
+            <w:r>
+              <w:rPr>
+                <w:rFonts w:hint="eastAsia" w:ascii="Times New Roman" w:hAnsi="Times New Roman" w:eastAsia="Times New Roman" w:cs="Times New Roman"/>
+                <w:b/>
+              </w:rPr>
+              <w:t>：d</w:t>
+            </w:r>
+            <w:r>
+              <w:rPr>
+                <w:rFonts w:hint="eastAsia" w:ascii="Times New Roman" w:hAnsi="Times New Roman" w:eastAsia="Times New Roman" w:cs="Times New Roman"/>
+                <w:b/>
+                <w:vertAlign w:val="superscript"/>
+              </w:rPr>
+              <w:t>0</w:t>
+            </w:r>
+            <w:r>
+              <w:rPr>
+                <w:rFonts w:hint="eastAsia" w:ascii="Times New Roman" w:hAnsi="Times New Roman" w:eastAsia="Times New Roman" w:cs="Times New Roman"/>
+                <w:b/>
+              </w:rPr>
+              <w:t>/d</w:t>
+            </w:r>
+            <w:r>
+              <w:rPr>
+                <w:rFonts w:hint="eastAsia" w:ascii="Times New Roman" w:hAnsi="Times New Roman" w:eastAsia="Times New Roman" w:cs="Times New Roman"/>
+                <w:b/>
+                <w:vertAlign w:val="superscript"/>
+              </w:rPr>
+              <w:t>10</w:t>
+            </w:r>
+            <w:r>
+              <w:rPr>
+                <w:rFonts w:ascii="Times New Roman" w:hAnsi="Times New Roman" w:eastAsia="Times New Roman" w:cs="Times New Roman"/>
+                <w:b/>
+              </w:rPr>
+              <w:t xml:space="preserve"> </w:t>
+            </w:r>
+            <w:r>
+              <w:rPr>
+                <w:rFonts w:hint="eastAsia" w:ascii="Times New Roman" w:hAnsi="Times New Roman" w:eastAsia="SimHei" w:cs="Times New Roman"/>
+                <w:b/>
+              </w:rPr>
+              <w:t xml:space="preserve">离子</w:t>
+            </w:r>
+          </w:p>
+        </w:tc>
+      </w:tr>
+      <w:tr>
+        <w:tc>
+          <w:tcPr/>
+          <w:p>
+            <w:pPr>
+              <w:pStyle w:val="Compact"/>
+              <w:jc w:val="center"/>
+            </w:pPr>
+            <w:r>
+              <w:rPr>
+                <w:rFonts w:ascii="Times New Roman" w:hAnsi="Times New Roman" w:eastAsia="Times New Roman" w:cs="Times New Roman"/>
+              </w:rPr>
+              <w:drawing>
+                <wp:inline>
+                  <wp:extent cx="2667000" cy="1298938"/>
+                  <wp:effectExtent b="0" l="0" r="0" t="0"/>
+                  <wp:docPr descr="" title="" id="36" name="Picture"/>
+                  <a:graphic>
+                    <a:graphicData uri="http://schemas.openxmlformats.org/drawingml/2006/picture">
+                      <pic:pic>
+                        <pic:nvPicPr>
+                          <pic:cNvPr descr="d7b33da4c59650effe5b5107280eca5cb04e077417f83697d268ef8bc480fac4.png" id="37" name="Picture"/>
+                          <pic:cNvPicPr>
+                            <a:picLocks noChangeArrowheads="1" noChangeAspect="1"/>
+                          </pic:cNvPicPr>
+                        </pic:nvPicPr>
+                        <pic:blipFill>
+                          <a:blip r:embed="rId35"/>
+                          <a:stretch>
+                            <a:fillRect/>
+                          </a:stretch>
+                        </pic:blipFill>
+                        <pic:spPr bwMode="auto">
+                          <a:xfrm>
+                            <a:off x="0" y="0"/>
+                            <a:ext cx="2667000" cy="1298938"/>
+                          </a:xfrm>
+                          <a:prstGeom prst="rect">
+                            <a:avLst/>
+                          </a:prstGeom>
+                          <a:noFill/>
+                          <a:ln w="9525">
+                            <a:noFill/>
+                            <a:headEnd/>
+                            <a:tailEnd/>
+                          </a:ln>
+                        </pic:spPr>
+                      </pic:pic>
+                    </a:graphicData>
+                  </a:graphic>
+                </wp:inline>
+              </w:drawing>
+            </w:r>
+          </w:p>
+        </w:tc>
+      </w:tr>
+      <w:tr>
+        <w:tc>
+          <w:tcPr/>
+          <w:p>
+            <w:pPr>
+              <w:pStyle w:val="Compact"/>
+              <w:jc w:val="center"/>
+            </w:pPr>
+            <w:r>
+              <w:rPr>
+                <w:rFonts w:ascii="Times New Roman" w:hAnsi="Times New Roman" w:eastAsia="Times New Roman" w:cs="Times New Roman"/>
+              </w:rPr>
+              <w:t xml:space="preserve">&gt; </w:t>
+            </w:r>
+            <w:r>
+              <w:rPr>
+                <w:rFonts w:hint="eastAsia" w:ascii="Times New Roman" w:hAnsi="Times New Roman" w:eastAsia="FangSong" w:cs="Times New Roman"/>
+              </w:rPr>
+              <w:t xml:space="preserve">图</w:t>
+            </w:r>
+            <w:r>
+              <w:rPr>
+                <w:rFonts w:ascii="Times New Roman" w:hAnsi="Times New Roman" w:eastAsia="Times New Roman" w:cs="Times New Roman"/>
+              </w:rPr>
+              <w:t xml:space="preserve"> </w:t>
+            </w:r>
+            <w:r>
+              <w:rPr>
+                <w:rFonts w:hint="eastAsia" w:ascii="Times New Roman" w:hAnsi="Times New Roman" w:eastAsia="Times New Roman" w:cs="Times New Roman"/>
+              </w:rPr>
+              <w:t>8-4：</w:t>
+            </w:r>
+            <w:r>
+              <w:rPr>
+                <w:rFonts w:hint="eastAsia" w:ascii="Times New Roman" w:hAnsi="Times New Roman" w:eastAsia="FangSong" w:cs="Times New Roman"/>
+              </w:rPr>
+              <w:t>元素推断色彩陷阱</w:t>
+            </w:r>
+            <w:r>
+              <w:rPr>
+                <w:rFonts w:hint="eastAsia" w:ascii="Times New Roman" w:hAnsi="Times New Roman" w:eastAsia="Times New Roman" w:cs="Times New Roman"/>
+              </w:rPr>
+              <w:t>：d</w:t>
+            </w:r>
+            <w:r>
+              <w:rPr>
+                <w:rFonts w:hint="eastAsia" w:ascii="Times New Roman" w:hAnsi="Times New Roman" w:eastAsia="Times New Roman" w:cs="Times New Roman"/>
+                <w:vertAlign w:val="superscript"/>
+              </w:rPr>
+              <w:t>0</w:t>
+            </w:r>
+            <w:r>
+              <w:rPr>
+                <w:rFonts w:hint="eastAsia" w:ascii="Times New Roman" w:hAnsi="Times New Roman" w:eastAsia="Times New Roman" w:cs="Times New Roman"/>
+              </w:rPr>
+              <w:t>/d</w:t>
+            </w:r>
+            <w:r>
+              <w:rPr>
+                <w:rFonts w:hint="eastAsia" w:ascii="Times New Roman" w:hAnsi="Times New Roman" w:eastAsia="Times New Roman" w:cs="Times New Roman"/>
+                <w:vertAlign w:val="superscript"/>
+              </w:rPr>
+              <w:t>10</w:t>
+            </w:r>
+            <w:r>
+              <w:rPr>
+                <w:rFonts w:ascii="Times New Roman" w:hAnsi="Times New Roman" w:eastAsia="Times New Roman" w:cs="Times New Roman"/>
+              </w:rPr>
+              <w:t xml:space="preserve"> </w:t>
+            </w:r>
+            <w:r>
+              <w:rPr>
+                <w:rFonts w:hint="eastAsia" w:ascii="Times New Roman" w:hAnsi="Times New Roman" w:eastAsia="FangSong" w:cs="Times New Roman"/>
+              </w:rPr>
+              <w:t>离子不一定无色</w:t>
+            </w:r>
+            <w:r>
+              <w:rPr>
+                <w:rFonts w:hint="eastAsia" w:ascii="Times New Roman" w:hAnsi="Times New Roman" w:eastAsia="Times New Roman" w:cs="Times New Roman"/>
+              </w:rPr>
+              <w:t>（</w:t>
+            </w:r>
+            <w:r>
+              <w:rPr>
+                <w:rFonts w:hint="eastAsia" w:ascii="Times New Roman" w:hAnsi="Times New Roman" w:eastAsia="FangSong" w:cs="Times New Roman"/>
+              </w:rPr>
+              <w:t>警惕</w:t>
+            </w:r>
+            <w:r>
+              <w:rPr>
+                <w:rFonts w:ascii="Times New Roman" w:hAnsi="Times New Roman" w:eastAsia="Times New Roman" w:cs="Times New Roman"/>
+              </w:rPr>
+              <w:t xml:space="preserve"> LMCT </w:t>
+            </w:r>
+            <w:r>
+              <w:rPr>
+                <w:rFonts w:hint="eastAsia" w:ascii="Times New Roman" w:hAnsi="Times New Roman" w:eastAsia="FangSong" w:cs="Times New Roman"/>
+              </w:rPr>
+              <w:t>配体</w:t>
+            </w:r>
+            <w:r>
+              <w:rPr>
+                <w:rFonts w:hint="eastAsia" w:ascii="Times New Roman" w:hAnsi="Times New Roman" w:eastAsia="Times New Roman" w:cs="Times New Roman"/>
+              </w:rPr>
+              <w:t>-</w:t>
+            </w:r>
+            <w:r>
+              <w:rPr>
+                <w:rFonts w:hint="eastAsia" w:ascii="Times New Roman" w:hAnsi="Times New Roman" w:eastAsia="FangSong" w:cs="Times New Roman"/>
+              </w:rPr>
+              <w:t>金属电荷转移跃迁</w:t>
+            </w:r>
+            <w:r>
+              <w:rPr>
+                <w:rFonts w:hint="eastAsia" w:ascii="Times New Roman" w:hAnsi="Times New Roman" w:eastAsia="Times New Roman" w:cs="Times New Roman"/>
+              </w:rPr>
+              <w:t>）</w:t>
+            </w:r>
+          </w:p>
+        </w:tc>
+      </w:tr>
+    </w:tbl>
     <w:p>
       <w:pPr>
         <w:spacing w:before="160" w:after="80"/>
@@ -17554,9 +19836,9 @@
         </w:pict>
       </w:r>
     </w:p>
-    <w:bookmarkEnd w:id="41"/>
-    <w:bookmarkEnd w:id="42"/>
-    <w:bookmarkStart w:id="47" w:name="五步推断法与进阶工具"/>
+    <w:bookmarkEnd w:id="38"/>
+    <w:bookmarkEnd w:id="39"/>
+    <w:bookmarkStart w:id="44" w:name="五步推断法与进阶工具"/>
     <w:p>
       <w:pPr>
         <w:pStyle w:val="Heading2"/>
@@ -17807,7 +20089,7 @@
         <w:t>。</w:t>
       </w:r>
     </w:p>
-    <w:bookmarkStart w:id="43" w:name="五步推断法进阶框架"/>
+    <w:bookmarkStart w:id="40" w:name="五步推断法进阶框架"/>
     <w:p>
       <w:pPr>
         <w:pStyle w:val="Heading3"/>
@@ -19000,8 +21282,8 @@
         <w:t>）。</w:t>
       </w:r>
     </w:p>
-    <w:bookmarkEnd w:id="43"/>
-    <w:bookmarkStart w:id="44" w:name="广义复盐法整体打包"/>
+    <w:bookmarkEnd w:id="40"/>
+    <w:bookmarkStart w:id="41" w:name="广义复盐法整体打包"/>
     <w:p>
       <w:pPr>
         <w:pStyle w:val="Heading3"/>
@@ -19690,8 +21972,8 @@
         <w:t xml:space="preserve">9）</w:t>
       </w:r>
     </w:p>
-    <w:bookmarkEnd w:id="44"/>
-    <w:bookmarkStart w:id="45" w:name="六大命题模式"/>
+    <w:bookmarkEnd w:id="41"/>
+    <w:bookmarkStart w:id="42" w:name="六大命题模式"/>
     <w:p>
       <w:pPr>
         <w:pStyle w:val="Heading3"/>
@@ -20385,8 +22667,8 @@
         <w:t>。</w:t>
       </w:r>
     </w:p>
-    <w:bookmarkEnd w:id="45"/>
-    <w:bookmarkStart w:id="46" w:name="化学史推断三步翻译法"/>
+    <w:bookmarkEnd w:id="42"/>
+    <w:bookmarkStart w:id="43" w:name="化学史推断三步翻译法"/>
     <w:p>
       <w:pPr>
         <w:pStyle w:val="Heading3"/>
@@ -21719,9 +24001,9 @@
         </w:pict>
       </w:r>
     </w:p>
-    <w:bookmarkEnd w:id="46"/>
-    <w:bookmarkEnd w:id="47"/>
-    <w:bookmarkStart w:id="52" w:name="真题实战与过程分"/>
+    <w:bookmarkEnd w:id="43"/>
+    <w:bookmarkEnd w:id="44"/>
+    <w:bookmarkStart w:id="49" w:name="真题实战与过程分"/>
     <w:p>
       <w:pPr>
         <w:pStyle w:val="Heading2"/>
@@ -21904,7 +24186,7 @@
         <w:t xml:space="preserve">。</w:t>
       </w:r>
     </w:p>
-    <w:bookmarkStart w:id="48" w:name="真题链映射按认知台阶递进"/>
+    <w:bookmarkStart w:id="45" w:name="真题链映射按认知台阶递进"/>
     <w:p>
       <w:pPr>
         <w:pStyle w:val="Heading3"/>
@@ -22738,8 +25020,8 @@
         </w:tc>
       </w:tr>
     </w:tbl>
-    <w:bookmarkEnd w:id="48"/>
-    <w:bookmarkStart w:id="49" w:name="排除法标准模板真题-无机-元素推断-卤素-001"/>
+    <w:bookmarkEnd w:id="45"/>
+    <w:bookmarkStart w:id="46" w:name="排除法标准模板真题-无机-元素推断-卤素-001"/>
     <w:p>
       <w:pPr>
         <w:pStyle w:val="Heading3"/>
@@ -24120,8 +26402,8 @@
         <w:t>。</w:t>
       </w:r>
     </w:p>
-    <w:bookmarkEnd w:id="49"/>
-    <w:bookmarkStart w:id="50" w:name="国初真题实战"/>
+    <w:bookmarkEnd w:id="46"/>
+    <w:bookmarkStart w:id="47" w:name="国初真题实战"/>
     <w:p>
       <w:pPr>
         <w:pStyle w:val="Heading3"/>
@@ -25059,8 +27341,8 @@
         <w:t>。</w:t>
       </w:r>
     </w:p>
-    <w:bookmarkEnd w:id="50"/>
-    <w:bookmarkStart w:id="51" w:name="过程分自查清单10-条"/>
+    <w:bookmarkEnd w:id="47"/>
+    <w:bookmarkStart w:id="48" w:name="过程分自查清单10-条"/>
     <w:p>
       <w:pPr>
         <w:pStyle w:val="Heading3"/>
@@ -25889,9 +28171,9 @@
         </w:pict>
       </w:r>
     </w:p>
-    <w:bookmarkEnd w:id="51"/>
-    <w:bookmarkEnd w:id="52"/>
-    <w:bookmarkStart w:id="54" w:name="课后习题"/>
+    <w:bookmarkEnd w:id="48"/>
+    <w:bookmarkEnd w:id="49"/>
+    <w:bookmarkStart w:id="51" w:name="课后习题"/>
     <w:p>
       <w:pPr>
         <w:pStyle w:val="Heading2"/>
@@ -32479,7 +34761,7 @@
         <w:t>4</w:t>
       </w:r>
     </w:p>
-    <w:bookmarkStart w:id="53" w:name="参考答案与精解"/>
+    <w:bookmarkStart w:id="50" w:name="参考答案与精解"/>
     <w:p>
       <w:pPr>
         <w:pStyle w:val="Heading3"/>
@@ -49006,8 +51288,8 @@
         <w:t>。</w:t>
       </w:r>
     </w:p>
-    <w:bookmarkEnd w:id="53"/>
-    <w:bookmarkEnd w:id="54"/>
+    <w:bookmarkEnd w:id="50"/>
+    <w:bookmarkEnd w:id="51"/>
     <w:sectPr>
       <w:footerReference w:type="default" r:id="rId9"/>
       <w:footnotePr>

</xml_diff>